<commit_message>
Serve CV as PDF download
Contact Download CV now points at Kishan-Sobhee-Resume.pdf.

Co-authored-by: Cursor <cursoragent@cursor.com>
</commit_message>
<xml_diff>
--- a/cv/Kishan-Sobhee-Resume.docx
+++ b/cv/Kishan-Sobhee-Resume.docx
@@ -34,6 +34,93 @@
     </w:p>
     <w:p>
       <w:pPr>
+        <w:jc w:val="center"/>
+      </w:pPr>
+      <w:r>
+        <w:rPr>
+          <w:rFonts w:ascii="Calibri" w:hAnsi="Calibri" w:eastAsia="Calibri"/>
+          <w:b w:val="0"/>
+          <w:color w:val="7F7F7F"/>
+          <w:sz w:val="20"/>
+        </w:rPr>
+        <w:t xml:space="preserve">Vacoas, Mauritius  |  </w:t>
+      </w:r>
+      <w:hyperlink r:id="rId9">
+        <w:r>
+          <w:rPr>
+            <w:color w:val="7F7F7F"/>
+            <w:u w:val="single"/>
+            <w:sz w:val="20"/>
+            <w:szCs w:val="20"/>
+            <w:rFonts w:ascii="Calibri" w:hAnsi="Calibri" w:eastAsia="Calibri"/>
+          </w:rPr>
+          <w:t>kibee0506@gmail.com</w:t>
+        </w:r>
+      </w:hyperlink>
+      <w:r>
+        <w:rPr>
+          <w:rFonts w:ascii="Calibri" w:hAnsi="Calibri" w:eastAsia="Calibri"/>
+          <w:b w:val="0"/>
+          <w:color w:val="7F7F7F"/>
+          <w:sz w:val="20"/>
+        </w:rPr>
+        <w:t xml:space="preserve">  |  </w:t>
+      </w:r>
+      <w:hyperlink r:id="rId10">
+        <w:r>
+          <w:rPr>
+            <w:color w:val="7F7F7F"/>
+            <w:u w:val="single"/>
+            <w:sz w:val="20"/>
+            <w:szCs w:val="20"/>
+            <w:rFonts w:ascii="Calibri" w:hAnsi="Calibri" w:eastAsia="Calibri"/>
+          </w:rPr>
+          <w:t>+230 5905 4115</w:t>
+        </w:r>
+      </w:hyperlink>
+    </w:p>
+    <w:p>
+      <w:pPr>
+        <w:spacing w:after="40"/>
+        <w:jc w:val="center"/>
+      </w:pPr>
+      <w:hyperlink r:id="rId11">
+        <w:r>
+          <w:rPr>
+            <w:color w:val="7F7F7F"/>
+            <w:u w:val="single"/>
+            <w:sz w:val="20"/>
+            <w:szCs w:val="20"/>
+            <w:rFonts w:ascii="Calibri" w:hAnsi="Calibri" w:eastAsia="Calibri"/>
+          </w:rPr>
+          <w:t>linkedin.com/in/ksobhee</w:t>
+        </w:r>
+      </w:hyperlink>
+      <w:r>
+        <w:rPr>
+          <w:rFonts w:ascii="Calibri" w:hAnsi="Calibri" w:eastAsia="Calibri"/>
+          <w:b w:val="0"/>
+          <w:color w:val="7F7F7F"/>
+          <w:sz w:val="20"/>
+        </w:rPr>
+        <w:t xml:space="preserve">  |  </w:t>
+      </w:r>
+      <w:hyperlink r:id="rId12">
+        <w:r>
+          <w:rPr>
+            <w:color w:val="7F7F7F"/>
+            <w:u w:val="single"/>
+            <w:sz w:val="20"/>
+            <w:szCs w:val="20"/>
+            <w:rFonts w:ascii="Calibri" w:hAnsi="Calibri" w:eastAsia="Calibri"/>
+          </w:rPr>
+          <w:t>kishan-1000101.github.io/portfolio</w:t>
+        </w:r>
+      </w:hyperlink>
+    </w:p>
+    <w:p>
+      <w:pPr>
+        <w:keepNext/>
         <w:spacing w:before="240" w:after="80"/>
       </w:pPr>
       <w:r>
@@ -57,11 +144,12 @@
           <w:color w:val="000000"/>
           <w:sz w:val="22"/>
         </w:rPr>
-        <w:t>Full-stack developer focused on software that runs real business operations. I start from the existing workflow, then design and deliver systems into production and support them after launch. The aim is practical: fewer manual steps, fewer errors, and time returned to the team.</w:t>
+        <w:t>Full-stack developer with 3+ years delivering production systems in Laravel and React, from multi-tenant SaaS to marketplaces and booking platforms. Works with AI-assisted development (Cursor) and ships AI features such as a customer support chatbot and camera OCR onboarding. Sole developer on KeyCars, a car rental SaaS, and project manager on ZilMall, a Mauritius multi-vendor marketplace, owning scope, release priorities and stakeholder communication. Has delivered for local and international clients across Europe, the Indian Ocean and Australasia. Open to full-time or contract roles, remote or hybrid. Based in Mauritius (GMT+4).</w:t>
       </w:r>
     </w:p>
     <w:p>
       <w:pPr>
+        <w:keepNext/>
         <w:spacing w:before="240" w:after="80"/>
       </w:pPr>
       <w:r>
@@ -145,21 +233,7 @@
     </w:p>
     <w:p>
       <w:pPr>
-        <w:spacing w:before="240" w:after="80"/>
-      </w:pPr>
-      <w:r>
-        <w:rPr>
-          <w:rFonts w:ascii="Calibri" w:hAnsi="Calibri" w:eastAsia="Calibri"/>
-          <w:b/>
-          <w:color w:val="0B769F"/>
-          <w:sz w:val="22"/>
-        </w:rPr>
-        <w:t>EMPLOYMENT</w:t>
-      </w:r>
-    </w:p>
-    <w:p>
-      <w:pPr>
-        <w:spacing w:before="160" w:after="20"/>
+        <w:spacing w:before="60" w:after="0"/>
       </w:pPr>
       <w:r>
         <w:rPr>
@@ -168,52 +242,8 @@
           <w:color w:val="000000"/>
           <w:sz w:val="22"/>
         </w:rPr>
-        <w:t>Agence ISCL (Linar)</w:t>
+        <w:t xml:space="preserve">Languages: </w:t>
       </w:r>
-      <w:r>
-        <w:rPr>
-          <w:rFonts w:ascii="Calibri" w:hAnsi="Calibri" w:eastAsia="Calibri"/>
-          <w:b w:val="0"/>
-          <w:color w:val="7F7F7F"/>
-          <w:sz w:val="20"/>
-        </w:rPr>
-        <w:t xml:space="preserve"> | Réunion · Remote</w:t>
-      </w:r>
-    </w:p>
-    <w:p>
-      <w:pPr>
-        <w:spacing w:before="80" w:after="0"/>
-      </w:pPr>
-      <w:r>
-        <w:rPr>
-          <w:rFonts w:ascii="Calibri" w:hAnsi="Calibri" w:eastAsia="Calibri"/>
-          <w:b/>
-          <w:color w:val="000000"/>
-          <w:sz w:val="22"/>
-        </w:rPr>
-        <w:t>Full Stack Developer</w:t>
-      </w:r>
-    </w:p>
-    <w:p>
-      <w:pPr>
-        <w:spacing w:before="0" w:after="40"/>
-      </w:pPr>
-      <w:r>
-        <w:rPr>
-          <w:rFonts w:ascii="Calibri" w:hAnsi="Calibri" w:eastAsia="Calibri"/>
-          <w:b w:val="0"/>
-          <w:color w:val="7F7F7F"/>
-          <w:sz w:val="20"/>
-        </w:rPr>
-        <w:t>Full-time · Oct 2025 - Sep 2026</w:t>
-      </w:r>
-    </w:p>
-    <w:p>
-      <w:pPr>
-        <w:pStyle w:val="ListBullet"/>
-        <w:spacing w:before="0" w:after="20"/>
-        <w:ind w:left="360"/>
-      </w:pPr>
       <w:r>
         <w:rPr>
           <w:rFonts w:ascii="Calibri" w:hAnsi="Calibri" w:eastAsia="Calibri"/>
@@ -221,189 +251,12 @@
           <w:color w:val="000000"/>
           <w:sz w:val="22"/>
         </w:rPr>
-        <w:t>Built KeyCars (keycars.fr): multi-tenant car rental SaaS in Laravel, React and TypeScript. Pricing, OCR, contracts, inspections. QA on rentflo.fr.</w:t>
+        <w:t>English, French, Creole (fluent)</w:t>
       </w:r>
     </w:p>
     <w:p>
       <w:pPr>
-        <w:spacing w:before="80" w:after="0"/>
-      </w:pPr>
-      <w:r>
-        <w:rPr>
-          <w:rFonts w:ascii="Calibri" w:hAnsi="Calibri" w:eastAsia="Calibri"/>
-          <w:b/>
-          <w:color w:val="000000"/>
-          <w:sz w:val="22"/>
-        </w:rPr>
-        <w:t>Full Stack Developer</w:t>
-      </w:r>
-    </w:p>
-    <w:p>
-      <w:pPr>
-        <w:spacing w:before="0" w:after="40"/>
-      </w:pPr>
-      <w:r>
-        <w:rPr>
-          <w:rFonts w:ascii="Calibri" w:hAnsi="Calibri" w:eastAsia="Calibri"/>
-          <w:b w:val="0"/>
-          <w:color w:val="7F7F7F"/>
-          <w:sz w:val="20"/>
-        </w:rPr>
-        <w:t>Part-time · Jun 2025 - Oct 2025</w:t>
-      </w:r>
-    </w:p>
-    <w:p>
-      <w:pPr>
-        <w:pStyle w:val="ListBullet"/>
-        <w:spacing w:before="0" w:after="20"/>
-        <w:ind w:left="360"/>
-      </w:pPr>
-      <w:r>
-        <w:rPr>
-          <w:rFonts w:ascii="Calibri" w:hAnsi="Calibri" w:eastAsia="Calibri"/>
-          <w:b w:val="0"/>
-          <w:color w:val="000000"/>
-          <w:sz w:val="22"/>
-        </w:rPr>
-        <w:t>Built tracking-dashboard.fr (React, Supabase, n8n) and WordPress plugins.</w:t>
-      </w:r>
-    </w:p>
-    <w:p>
-      <w:pPr>
-        <w:spacing w:before="160" w:after="20"/>
-      </w:pPr>
-      <w:r>
-        <w:rPr>
-          <w:rFonts w:ascii="Calibri" w:hAnsi="Calibri" w:eastAsia="Calibri"/>
-          <w:b/>
-          <w:color w:val="000000"/>
-          <w:sz w:val="22"/>
-        </w:rPr>
-        <w:t>Agileum</w:t>
-      </w:r>
-      <w:r>
-        <w:rPr>
-          <w:rFonts w:ascii="Calibri" w:hAnsi="Calibri" w:eastAsia="Calibri"/>
-          <w:b w:val="0"/>
-          <w:color w:val="7F7F7F"/>
-          <w:sz w:val="20"/>
-        </w:rPr>
-        <w:t xml:space="preserve"> | Mauritius · Hybrid</w:t>
-      </w:r>
-    </w:p>
-    <w:p>
-      <w:pPr>
-        <w:spacing w:before="80" w:after="0"/>
-      </w:pPr>
-      <w:r>
-        <w:rPr>
-          <w:rFonts w:ascii="Calibri" w:hAnsi="Calibri" w:eastAsia="Calibri"/>
-          <w:b/>
-          <w:color w:val="000000"/>
-          <w:sz w:val="22"/>
-        </w:rPr>
-        <w:t>Associate Software Engineer</w:t>
-      </w:r>
-    </w:p>
-    <w:p>
-      <w:pPr>
-        <w:spacing w:before="0" w:after="40"/>
-      </w:pPr>
-      <w:r>
-        <w:rPr>
-          <w:rFonts w:ascii="Calibri" w:hAnsi="Calibri" w:eastAsia="Calibri"/>
-          <w:b w:val="0"/>
-          <w:color w:val="7F7F7F"/>
-          <w:sz w:val="20"/>
-        </w:rPr>
-        <w:t>Full-time · Jan 2025 - Oct 2025</w:t>
-      </w:r>
-    </w:p>
-    <w:p>
-      <w:pPr>
-        <w:pStyle w:val="ListBullet"/>
-        <w:spacing w:before="0" w:after="20"/>
-        <w:ind w:left="360"/>
-      </w:pPr>
-      <w:r>
-        <w:rPr>
-          <w:rFonts w:ascii="Calibri" w:hAnsi="Calibri" w:eastAsia="Calibri"/>
-          <w:b w:val="0"/>
-          <w:color w:val="000000"/>
-          <w:sz w:val="22"/>
-        </w:rPr>
-        <w:t>Delivery across Laravel, PHP, Node.js, Angular, Python and Drupal. AI chatbot, document automation, Docker/Nginx/Jenkins deployments, .NET Core migration support.</w:t>
-      </w:r>
-    </w:p>
-    <w:p>
-      <w:pPr>
-        <w:spacing w:before="160" w:after="20"/>
-      </w:pPr>
-      <w:r>
-        <w:rPr>
-          <w:rFonts w:ascii="Calibri" w:hAnsi="Calibri" w:eastAsia="Calibri"/>
-          <w:b/>
-          <w:color w:val="000000"/>
-          <w:sz w:val="22"/>
-        </w:rPr>
-        <w:t>Business Force Limited</w:t>
-      </w:r>
-      <w:r>
-        <w:rPr>
-          <w:rFonts w:ascii="Calibri" w:hAnsi="Calibri" w:eastAsia="Calibri"/>
-          <w:b w:val="0"/>
-          <w:color w:val="7F7F7F"/>
-          <w:sz w:val="20"/>
-        </w:rPr>
-        <w:t xml:space="preserve"> | Curepipe · Hybrid</w:t>
-      </w:r>
-    </w:p>
-    <w:p>
-      <w:pPr>
-        <w:spacing w:before="80" w:after="0"/>
-      </w:pPr>
-      <w:r>
-        <w:rPr>
-          <w:rFonts w:ascii="Calibri" w:hAnsi="Calibri" w:eastAsia="Calibri"/>
-          <w:b/>
-          <w:color w:val="000000"/>
-          <w:sz w:val="22"/>
-        </w:rPr>
-        <w:t>Information System Engineer</w:t>
-      </w:r>
-    </w:p>
-    <w:p>
-      <w:pPr>
-        <w:spacing w:before="0" w:after="40"/>
-      </w:pPr>
-      <w:r>
-        <w:rPr>
-          <w:rFonts w:ascii="Calibri" w:hAnsi="Calibri" w:eastAsia="Calibri"/>
-          <w:b w:val="0"/>
-          <w:color w:val="7F7F7F"/>
-          <w:sz w:val="20"/>
-        </w:rPr>
-        <w:t>Full-time · Feb 2023 - Sep 2024</w:t>
-      </w:r>
-    </w:p>
-    <w:p>
-      <w:pPr>
-        <w:pStyle w:val="ListBullet"/>
-        <w:spacing w:before="0" w:after="20"/>
-        <w:ind w:left="360"/>
-      </w:pPr>
-      <w:r>
-        <w:rPr>
-          <w:rFonts w:ascii="Calibri" w:hAnsi="Calibri" w:eastAsia="Calibri"/>
-          <w:b w:val="0"/>
-          <w:color w:val="000000"/>
-          <w:sz w:val="22"/>
-        </w:rPr>
-        <w:t>Salesforce (Apex, SOQL, Flows, Omnistudio), PL/SQL investigation, production support across time zones, Laravel/API work. Mentored two interns.</w:t>
-      </w:r>
-    </w:p>
-    <w:p>
-      <w:pPr>
+        <w:keepNext/>
         <w:spacing w:before="240" w:after="80"/>
       </w:pPr>
       <w:r>
@@ -418,46 +271,7 @@
     </w:p>
     <w:p>
       <w:pPr>
-        <w:spacing w:before="160" w:after="20"/>
-      </w:pPr>
-      <w:r>
-        <w:rPr>
-          <w:rFonts w:ascii="Calibri" w:hAnsi="Calibri" w:eastAsia="Calibri"/>
-          <w:b/>
-          <w:color w:val="000000"/>
-          <w:sz w:val="22"/>
-        </w:rPr>
-        <w:t>Agence ISCL (Linar)</w:t>
-      </w:r>
-      <w:r>
-        <w:rPr>
-          <w:rFonts w:ascii="Calibri" w:hAnsi="Calibri" w:eastAsia="Calibri"/>
-          <w:b w:val="0"/>
-          <w:color w:val="7F7F7F"/>
-          <w:sz w:val="20"/>
-        </w:rPr>
-        <w:t xml:space="preserve"> | Sep 2026 - Present · Réunion · Remote</w:t>
-      </w:r>
-    </w:p>
-    <w:p>
-      <w:pPr>
-        <w:spacing w:before="80" w:after="0"/>
-      </w:pPr>
-      <w:r>
-        <w:rPr>
-          <w:rFonts w:ascii="Calibri" w:hAnsi="Calibri" w:eastAsia="Calibri"/>
-          <w:b/>
-          <w:color w:val="000000"/>
-          <w:sz w:val="22"/>
-        </w:rPr>
-        <w:t>Full Stack Developer</w:t>
-      </w:r>
-    </w:p>
-    <w:p>
-      <w:pPr>
-        <w:pStyle w:val="ListBullet"/>
-        <w:spacing w:before="0" w:after="20"/>
-        <w:ind w:left="360"/>
+        <w:spacing w:before="40" w:after="40"/>
       </w:pPr>
       <w:r>
         <w:rPr>
@@ -466,11 +280,12 @@
           <w:color w:val="000000"/>
           <w:sz w:val="22"/>
         </w:rPr>
-        <w:t>Retained for upcoming projects (on call).</w:t>
+        <w:t>Current clients: ZilMall, MR Production and Agence ISCL (Linar), on contract since the full-time role below ended.</w:t>
       </w:r>
     </w:p>
     <w:p>
       <w:pPr>
+        <w:keepNext/>
         <w:spacing w:before="160" w:after="20"/>
       </w:pPr>
       <w:r>
@@ -500,7 +315,7 @@
         </w:rPr>
         <w:t xml:space="preserve"> · </w:t>
       </w:r>
-      <w:hyperlink r:id="rId9">
+      <w:hyperlink r:id="rId13">
         <w:r>
           <w:rPr>
             <w:color w:val="7F7F7F"/>
@@ -515,6 +330,7 @@
     </w:p>
     <w:p>
       <w:pPr>
+        <w:keepNext/>
         <w:spacing w:before="80" w:after="0"/>
       </w:pPr>
       <w:r>
@@ -540,11 +356,44 @@
           <w:color w:val="000000"/>
           <w:sz w:val="22"/>
         </w:rPr>
-        <w:t>Multi-vendor marketplace in Laravel, React and Inertia: storefront, seller portal, admin. Scope and release priorities with stakeholders.</w:t>
+        <w:t>Project manager and co-developer, with one other developer, of a Mauritius multi-vendor marketplace in Laravel 12, React 19 and Inertia: storefront, seller portal and admin in one codebase.</w:t>
       </w:r>
     </w:p>
     <w:p>
       <w:pPr>
+        <w:pStyle w:val="ListBullet"/>
+        <w:spacing w:before="0" w:after="20"/>
+        <w:ind w:left="360"/>
+      </w:pPr>
+      <w:r>
+        <w:rPr>
+          <w:rFonts w:ascii="Calibri" w:hAnsi="Calibri" w:eastAsia="Calibri"/>
+          <w:b w:val="0"/>
+          <w:color w:val="000000"/>
+          <w:sz w:val="22"/>
+        </w:rPr>
+        <w:t>Built onboarding for business and individual sellers, with documents, payouts and VAT details behind admin approval queues, plus wholesale pricing.</w:t>
+      </w:r>
+    </w:p>
+    <w:p>
+      <w:pPr>
+        <w:pStyle w:val="ListBullet"/>
+        <w:spacing w:before="0" w:after="20"/>
+        <w:ind w:left="360"/>
+      </w:pPr>
+      <w:r>
+        <w:rPr>
+          <w:rFonts w:ascii="Calibri" w:hAnsi="Calibri" w:eastAsia="Calibri"/>
+          <w:b w:val="0"/>
+          <w:color w:val="000000"/>
+          <w:sz w:val="22"/>
+        </w:rPr>
+        <w:t>Own scope, release priorities and stakeholder updates. Now in soft launch, onboarding the first sellers.</w:t>
+      </w:r>
+    </w:p>
+    <w:p>
+      <w:pPr>
+        <w:keepNext/>
         <w:spacing w:before="160" w:after="20"/>
       </w:pPr>
       <w:r>
@@ -574,7 +423,7 @@
         </w:rPr>
         <w:t xml:space="preserve"> · </w:t>
       </w:r>
-      <w:hyperlink r:id="rId10">
+      <w:hyperlink r:id="rId14">
         <w:r>
           <w:rPr>
             <w:color w:val="7F7F7F"/>
@@ -589,6 +438,7 @@
     </w:p>
     <w:p>
       <w:pPr>
+        <w:keepNext/>
         <w:spacing w:before="80" w:after="0"/>
       </w:pPr>
       <w:r>
@@ -614,11 +464,44 @@
           <w:color w:val="000000"/>
           <w:sz w:val="22"/>
         </w:rPr>
-        <w:t>Studio site and booking platform (Laravel, Filament, React) live on OVH.</w:t>
+        <w:t>Sole developer of the studio website and booking platform (Laravel, Filament, Inertia, React), live on OVH.</w:t>
       </w:r>
     </w:p>
     <w:p>
       <w:pPr>
+        <w:pStyle w:val="ListBullet"/>
+        <w:spacing w:before="0" w:after="20"/>
+        <w:ind w:left="360"/>
+      </w:pPr>
+      <w:r>
+        <w:rPr>
+          <w:rFonts w:ascii="Calibri" w:hAnsi="Calibri" w:eastAsia="Calibri"/>
+          <w:b w:val="0"/>
+          <w:color w:val="000000"/>
+          <w:sz w:val="22"/>
+        </w:rPr>
+        <w:t>Replaced booking over chat with a live calendar: blocked dates, multi-day and multi-location shoots, and budget options.</w:t>
+      </w:r>
+    </w:p>
+    <w:p>
+      <w:pPr>
+        <w:pStyle w:val="ListBullet"/>
+        <w:spacing w:before="0" w:after="20"/>
+        <w:ind w:left="360"/>
+      </w:pPr>
+      <w:r>
+        <w:rPr>
+          <w:rFonts w:ascii="Calibri" w:hAnsi="Calibri" w:eastAsia="Calibri"/>
+          <w:b w:val="0"/>
+          <w:color w:val="000000"/>
+          <w:sz w:val="22"/>
+        </w:rPr>
+        <w:t>Built a Filament admin so the studio runs bookings, crew, availability, portfolio and content itself.</w:t>
+      </w:r>
+    </w:p>
+    <w:p>
+      <w:pPr>
+        <w:keepNext/>
         <w:spacing w:before="160" w:after="20"/>
       </w:pPr>
       <w:r>
@@ -642,6 +525,7 @@
     </w:p>
     <w:p>
       <w:pPr>
+        <w:keepNext/>
         <w:spacing w:before="80" w:after="0"/>
       </w:pPr>
       <w:r>
@@ -667,11 +551,12 @@
           <w:color w:val="000000"/>
           <w:sz w:val="22"/>
         </w:rPr>
-        <w:t>Continued client delivery after the full-time role: features, integrations and fixes.</w:t>
+        <w:t>Contract continuation of client work from the full-time role: new features, integrations and production fixes.</w:t>
       </w:r>
     </w:p>
     <w:p>
       <w:pPr>
+        <w:keepNext/>
         <w:spacing w:before="160" w:after="20"/>
       </w:pPr>
       <w:r>
@@ -701,7 +586,7 @@
         </w:rPr>
         <w:t xml:space="preserve"> · </w:t>
       </w:r>
-      <w:hyperlink r:id="rId11">
+      <w:hyperlink r:id="rId15">
         <w:r>
           <w:rPr>
             <w:color w:val="7F7F7F"/>
@@ -716,6 +601,7 @@
     </w:p>
     <w:p>
       <w:pPr>
+        <w:keepNext/>
         <w:spacing w:before="80" w:after="0"/>
       </w:pPr>
       <w:r>
@@ -741,11 +627,27 @@
           <w:color w:val="000000"/>
           <w:sz w:val="22"/>
         </w:rPr>
-        <w:t>Designed, built and deployed the company site as sole developer.</w:t>
+        <w:t>Designed, built and deployed the company website as sole developer, with a responsive layout the team edits itself after handover.</w:t>
       </w:r>
     </w:p>
     <w:p>
       <w:pPr>
+        <w:keepNext/>
+        <w:spacing w:before="240" w:after="80"/>
+      </w:pPr>
+      <w:r>
+        <w:rPr>
+          <w:rFonts w:ascii="Calibri" w:hAnsi="Calibri" w:eastAsia="Calibri"/>
+          <w:b/>
+          <w:color w:val="0B769F"/>
+          <w:sz w:val="22"/>
+        </w:rPr>
+        <w:t>EMPLOYMENT</w:t>
+      </w:r>
+    </w:p>
+    <w:p>
+      <w:pPr>
+        <w:keepNext/>
         <w:spacing w:before="160" w:after="20"/>
       </w:pPr>
       <w:r>
@@ -755,7 +657,7 @@
           <w:color w:val="000000"/>
           <w:sz w:val="22"/>
         </w:rPr>
-        <w:t>Career break: PC building</w:t>
+        <w:t>Agence ISCL (Linar)</w:t>
       </w:r>
       <w:r>
         <w:rPr>
@@ -764,7 +666,37 @@
           <w:color w:val="7F7F7F"/>
           <w:sz w:val="20"/>
         </w:rPr>
-        <w:t xml:space="preserve"> | Oct 2024 - Dec 2024 · Mauritius</w:t>
+        <w:t xml:space="preserve"> | Réunion · Remote</w:t>
+      </w:r>
+    </w:p>
+    <w:p>
+      <w:pPr>
+        <w:keepNext/>
+        <w:spacing w:before="80" w:after="0"/>
+      </w:pPr>
+      <w:r>
+        <w:rPr>
+          <w:rFonts w:ascii="Calibri" w:hAnsi="Calibri" w:eastAsia="Calibri"/>
+          <w:b/>
+          <w:color w:val="000000"/>
+          <w:sz w:val="22"/>
+        </w:rPr>
+        <w:t>Full Stack Developer</w:t>
+      </w:r>
+    </w:p>
+    <w:p>
+      <w:pPr>
+        <w:keepNext/>
+        <w:spacing w:before="0" w:after="40"/>
+      </w:pPr>
+      <w:r>
+        <w:rPr>
+          <w:rFonts w:ascii="Calibri" w:hAnsi="Calibri" w:eastAsia="Calibri"/>
+          <w:b w:val="0"/>
+          <w:color w:val="7F7F7F"/>
+          <w:sz w:val="20"/>
+        </w:rPr>
+        <w:t>Full-time · Oct 2025 - Sep 2026</w:t>
       </w:r>
     </w:p>
     <w:p>
@@ -780,11 +712,326 @@
           <w:color w:val="000000"/>
           <w:sz w:val="22"/>
         </w:rPr>
-        <w:t>Built and sold custom gaming PCs.</w:t>
+        <w:t>Sole developer of KeyCars (keycars.fr), a multi-tenant car rental SaaS in Laravel 12, React, TypeScript and MySQL: 50+ domain models, company-scoped tenancy, and admin, manager and field agent roles.</w:t>
       </w:r>
     </w:p>
     <w:p>
       <w:pPr>
+        <w:pStyle w:val="ListBullet"/>
+        <w:spacing w:before="0" w:after="20"/>
+        <w:ind w:left="360"/>
+      </w:pPr>
+      <w:r>
+        <w:rPr>
+          <w:rFonts w:ascii="Calibri" w:hAnsi="Calibri" w:eastAsia="Calibri"/>
+          <w:b w:val="0"/>
+          <w:color w:val="000000"/>
+          <w:sz w:val="22"/>
+        </w:rPr>
+        <w:t>Built a pricing engine that picks the daily rate from plans, duration tiers, packages and seasonal rates.</w:t>
+      </w:r>
+    </w:p>
+    <w:p>
+      <w:pPr>
+        <w:pStyle w:val="ListBullet"/>
+        <w:spacing w:before="0" w:after="20"/>
+        <w:ind w:left="360"/>
+      </w:pPr>
+      <w:r>
+        <w:rPr>
+          <w:rFonts w:ascii="Calibri" w:hAnsi="Calibri" w:eastAsia="Calibri"/>
+          <w:b w:val="0"/>
+          <w:color w:val="000000"/>
+          <w:sz w:val="22"/>
+        </w:rPr>
+        <w:t>Automated quotes, contracts and invoices as PDFs, added camera OCR for customer records, and built vehicle inspections with damage diagrams, photos and dual signatures.</w:t>
+      </w:r>
+    </w:p>
+    <w:p>
+      <w:pPr>
+        <w:pStyle w:val="ListBullet"/>
+        <w:spacing w:before="0" w:after="20"/>
+        <w:ind w:left="360"/>
+      </w:pPr>
+      <w:r>
+        <w:rPr>
+          <w:rFonts w:ascii="Calibri" w:hAnsi="Calibri" w:eastAsia="Calibri"/>
+          <w:b w:val="0"/>
+          <w:color w:val="000000"/>
+          <w:sz w:val="22"/>
+        </w:rPr>
+        <w:t>QA on rentflo.fr, a related rental product.</w:t>
+      </w:r>
+    </w:p>
+    <w:p>
+      <w:pPr>
+        <w:keepNext/>
+        <w:spacing w:before="80" w:after="0"/>
+      </w:pPr>
+      <w:r>
+        <w:rPr>
+          <w:rFonts w:ascii="Calibri" w:hAnsi="Calibri" w:eastAsia="Calibri"/>
+          <w:b/>
+          <w:color w:val="000000"/>
+          <w:sz w:val="22"/>
+        </w:rPr>
+        <w:t>Full Stack Developer</w:t>
+      </w:r>
+    </w:p>
+    <w:p>
+      <w:pPr>
+        <w:keepNext/>
+        <w:spacing w:before="0" w:after="40"/>
+      </w:pPr>
+      <w:r>
+        <w:rPr>
+          <w:rFonts w:ascii="Calibri" w:hAnsi="Calibri" w:eastAsia="Calibri"/>
+          <w:b w:val="0"/>
+          <w:color w:val="7F7F7F"/>
+          <w:sz w:val="20"/>
+        </w:rPr>
+        <w:t>Part-time · Jun 2025 - Oct 2025</w:t>
+      </w:r>
+    </w:p>
+    <w:p>
+      <w:pPr>
+        <w:pStyle w:val="ListBullet"/>
+        <w:spacing w:before="0" w:after="20"/>
+        <w:ind w:left="360"/>
+      </w:pPr>
+      <w:r>
+        <w:rPr>
+          <w:rFonts w:ascii="Calibri" w:hAnsi="Calibri" w:eastAsia="Calibri"/>
+          <w:b w:val="0"/>
+          <w:color w:val="000000"/>
+          <w:sz w:val="22"/>
+        </w:rPr>
+        <w:t>Built tracking-dashboard.fr: white-label, multi-tenant marketing dashboards in React, TypeScript and Supabase, fed by scheduled n8n workflows, replacing manually built client reports.</w:t>
+      </w:r>
+    </w:p>
+    <w:p>
+      <w:pPr>
+        <w:pStyle w:val="ListBullet"/>
+        <w:spacing w:before="0" w:after="20"/>
+        <w:ind w:left="360"/>
+      </w:pPr>
+      <w:r>
+        <w:rPr>
+          <w:rFonts w:ascii="Calibri" w:hAnsi="Calibri" w:eastAsia="Calibri"/>
+          <w:b w:val="0"/>
+          <w:color w:val="000000"/>
+          <w:sz w:val="22"/>
+        </w:rPr>
+        <w:t>Built custom WordPress plugins for the agency.</w:t>
+      </w:r>
+    </w:p>
+    <w:p>
+      <w:pPr>
+        <w:keepNext/>
+        <w:spacing w:before="160" w:after="20"/>
+      </w:pPr>
+      <w:r>
+        <w:rPr>
+          <w:rFonts w:ascii="Calibri" w:hAnsi="Calibri" w:eastAsia="Calibri"/>
+          <w:b/>
+          <w:color w:val="000000"/>
+          <w:sz w:val="22"/>
+        </w:rPr>
+        <w:t>Agileum</w:t>
+      </w:r>
+      <w:r>
+        <w:rPr>
+          <w:rFonts w:ascii="Calibri" w:hAnsi="Calibri" w:eastAsia="Calibri"/>
+          <w:b w:val="0"/>
+          <w:color w:val="7F7F7F"/>
+          <w:sz w:val="20"/>
+        </w:rPr>
+        <w:t xml:space="preserve"> | Mauritius · Hybrid</w:t>
+      </w:r>
+    </w:p>
+    <w:p>
+      <w:pPr>
+        <w:keepNext/>
+        <w:spacing w:before="80" w:after="0"/>
+      </w:pPr>
+      <w:r>
+        <w:rPr>
+          <w:rFonts w:ascii="Calibri" w:hAnsi="Calibri" w:eastAsia="Calibri"/>
+          <w:b/>
+          <w:color w:val="000000"/>
+          <w:sz w:val="22"/>
+        </w:rPr>
+        <w:t>Associate Software Engineer</w:t>
+      </w:r>
+    </w:p>
+    <w:p>
+      <w:pPr>
+        <w:keepNext/>
+        <w:spacing w:before="0" w:after="40"/>
+      </w:pPr>
+      <w:r>
+        <w:rPr>
+          <w:rFonts w:ascii="Calibri" w:hAnsi="Calibri" w:eastAsia="Calibri"/>
+          <w:b w:val="0"/>
+          <w:color w:val="7F7F7F"/>
+          <w:sz w:val="20"/>
+        </w:rPr>
+        <w:t>Full-time · Jan 2025 - Oct 2025</w:t>
+      </w:r>
+    </w:p>
+    <w:p>
+      <w:pPr>
+        <w:pStyle w:val="ListBullet"/>
+        <w:spacing w:before="0" w:after="20"/>
+        <w:ind w:left="360"/>
+      </w:pPr>
+      <w:r>
+        <w:rPr>
+          <w:rFonts w:ascii="Calibri" w:hAnsi="Calibri" w:eastAsia="Calibri"/>
+          <w:b w:val="0"/>
+          <w:color w:val="000000"/>
+          <w:sz w:val="22"/>
+        </w:rPr>
+        <w:t>Built and maintained client applications across Laravel, PHP, Node.js, Angular, Python and Drupal.</w:t>
+      </w:r>
+    </w:p>
+    <w:p>
+      <w:pPr>
+        <w:pStyle w:val="ListBullet"/>
+        <w:spacing w:before="0" w:after="20"/>
+        <w:ind w:left="360"/>
+      </w:pPr>
+      <w:r>
+        <w:rPr>
+          <w:rFonts w:ascii="Calibri" w:hAnsi="Calibri" w:eastAsia="Calibri"/>
+          <w:b w:val="0"/>
+          <w:color w:val="000000"/>
+          <w:sz w:val="22"/>
+        </w:rPr>
+        <w:t>Delivered an AI support chatbot for a client's customers, plus document automation.</w:t>
+      </w:r>
+    </w:p>
+    <w:p>
+      <w:pPr>
+        <w:pStyle w:val="ListBullet"/>
+        <w:spacing w:before="0" w:after="20"/>
+        <w:ind w:left="360"/>
+      </w:pPr>
+      <w:r>
+        <w:rPr>
+          <w:rFonts w:ascii="Calibri" w:hAnsi="Calibri" w:eastAsia="Calibri"/>
+          <w:b w:val="0"/>
+          <w:color w:val="000000"/>
+          <w:sz w:val="22"/>
+        </w:rPr>
+        <w:t>Set up deployments with Docker, Nginx and Jenkins, and supported a .NET Core migration.</w:t>
+      </w:r>
+    </w:p>
+    <w:p>
+      <w:pPr>
+        <w:keepNext/>
+        <w:spacing w:before="160" w:after="20"/>
+      </w:pPr>
+      <w:r>
+        <w:rPr>
+          <w:rFonts w:ascii="Calibri" w:hAnsi="Calibri" w:eastAsia="Calibri"/>
+          <w:b/>
+          <w:color w:val="000000"/>
+          <w:sz w:val="22"/>
+        </w:rPr>
+        <w:t>Business Force Limited</w:t>
+      </w:r>
+      <w:r>
+        <w:rPr>
+          <w:rFonts w:ascii="Calibri" w:hAnsi="Calibri" w:eastAsia="Calibri"/>
+          <w:b w:val="0"/>
+          <w:color w:val="7F7F7F"/>
+          <w:sz w:val="20"/>
+        </w:rPr>
+        <w:t xml:space="preserve"> | Curepipe · Hybrid</w:t>
+      </w:r>
+    </w:p>
+    <w:p>
+      <w:pPr>
+        <w:keepNext/>
+        <w:spacing w:before="80" w:after="0"/>
+      </w:pPr>
+      <w:r>
+        <w:rPr>
+          <w:rFonts w:ascii="Calibri" w:hAnsi="Calibri" w:eastAsia="Calibri"/>
+          <w:b/>
+          <w:color w:val="000000"/>
+          <w:sz w:val="22"/>
+        </w:rPr>
+        <w:t>Information System Engineer</w:t>
+      </w:r>
+    </w:p>
+    <w:p>
+      <w:pPr>
+        <w:keepNext/>
+        <w:spacing w:before="0" w:after="40"/>
+      </w:pPr>
+      <w:r>
+        <w:rPr>
+          <w:rFonts w:ascii="Calibri" w:hAnsi="Calibri" w:eastAsia="Calibri"/>
+          <w:b w:val="0"/>
+          <w:color w:val="7F7F7F"/>
+          <w:sz w:val="20"/>
+        </w:rPr>
+        <w:t>Full-time · Feb 2023 - Sep 2024</w:t>
+      </w:r>
+    </w:p>
+    <w:p>
+      <w:pPr>
+        <w:pStyle w:val="ListBullet"/>
+        <w:spacing w:before="0" w:after="20"/>
+        <w:ind w:left="360"/>
+      </w:pPr>
+      <w:r>
+        <w:rPr>
+          <w:rFonts w:ascii="Calibri" w:hAnsi="Calibri" w:eastAsia="Calibri"/>
+          <w:b w:val="0"/>
+          <w:color w:val="000000"/>
+          <w:sz w:val="22"/>
+        </w:rPr>
+        <w:t>Delivered Salesforce features with Apex, SOQL, Flows and Omnistudio.</w:t>
+      </w:r>
+    </w:p>
+    <w:p>
+      <w:pPr>
+        <w:pStyle w:val="ListBullet"/>
+        <w:spacing w:before="0" w:after="20"/>
+        <w:ind w:left="360"/>
+      </w:pPr>
+      <w:r>
+        <w:rPr>
+          <w:rFonts w:ascii="Calibri" w:hAnsi="Calibri" w:eastAsia="Calibri"/>
+          <w:b w:val="0"/>
+          <w:color w:val="000000"/>
+          <w:sz w:val="22"/>
+        </w:rPr>
+        <w:t>Provided production support for users in New Zealand, Australia and France, investigating data issues in Oracle PL/SQL.</w:t>
+      </w:r>
+    </w:p>
+    <w:p>
+      <w:pPr>
+        <w:pStyle w:val="ListBullet"/>
+        <w:spacing w:before="0" w:after="20"/>
+        <w:ind w:left="360"/>
+      </w:pPr>
+      <w:r>
+        <w:rPr>
+          <w:rFonts w:ascii="Calibri" w:hAnsi="Calibri" w:eastAsia="Calibri"/>
+          <w:b w:val="0"/>
+          <w:color w:val="000000"/>
+          <w:sz w:val="22"/>
+        </w:rPr>
+        <w:t>Worked on Laravel and REST API development, and mentored two interns.</w:t>
+      </w:r>
+    </w:p>
+    <w:p>
+      <w:pPr>
+        <w:keepNext/>
         <w:spacing w:before="240" w:after="80"/>
       </w:pPr>
       <w:r>
@@ -795,6 +1042,43 @@
           <w:sz w:val="22"/>
         </w:rPr>
         <w:t>EDUCATION</w:t>
+      </w:r>
+    </w:p>
+    <w:p>
+      <w:pPr>
+        <w:spacing w:before="80" w:after="0"/>
+      </w:pPr>
+      <w:r>
+        <w:rPr>
+          <w:rFonts w:ascii="Calibri" w:hAnsi="Calibri" w:eastAsia="Calibri"/>
+          <w:b/>
+          <w:color w:val="000000"/>
+          <w:sz w:val="22"/>
+        </w:rPr>
+        <w:t>University of Technology, Mauritius</w:t>
+      </w:r>
+    </w:p>
+    <w:p>
+      <w:pPr>
+        <w:spacing w:after="0"/>
+      </w:pPr>
+      <w:r>
+        <w:rPr>
+          <w:rFonts w:ascii="Calibri" w:hAnsi="Calibri" w:eastAsia="Calibri"/>
+          <w:b w:val="0"/>
+          <w:color w:val="000000"/>
+          <w:sz w:val="22"/>
+        </w:rPr>
+        <w:t>BSc (Hons) Software Engineering, Upper Second Class (2:1)</w:t>
+      </w:r>
+      <w:r>
+        <w:rPr>
+          <w:rFonts w:ascii="Calibri" w:hAnsi="Calibri" w:eastAsia="Calibri"/>
+          <w:b w:val="0"/>
+          <w:color w:val="7F7F7F"/>
+          <w:sz w:val="20"/>
+        </w:rPr>
+        <w:t xml:space="preserve">  Sep 2021 - 2025</w:t>
       </w:r>
     </w:p>
     <w:p>
@@ -822,7 +1106,7 @@
           <w:color w:val="000000"/>
           <w:sz w:val="22"/>
         </w:rPr>
-        <w:t>Seeds For The Future Program</w:t>
+        <w:t>Seeds for the Future Program</w:t>
       </w:r>
       <w:r>
         <w:rPr>
@@ -832,43 +1116,6 @@
           <w:sz w:val="20"/>
         </w:rPr>
         <w:t xml:space="preserve">  2023 - 2024</w:t>
-      </w:r>
-    </w:p>
-    <w:p>
-      <w:pPr>
-        <w:spacing w:before="80" w:after="0"/>
-      </w:pPr>
-      <w:r>
-        <w:rPr>
-          <w:rFonts w:ascii="Calibri" w:hAnsi="Calibri" w:eastAsia="Calibri"/>
-          <w:b/>
-          <w:color w:val="000000"/>
-          <w:sz w:val="22"/>
-        </w:rPr>
-        <w:t>University of Technology, Mauritius</w:t>
-      </w:r>
-    </w:p>
-    <w:p>
-      <w:pPr>
-        <w:spacing w:after="0"/>
-      </w:pPr>
-      <w:r>
-        <w:rPr>
-          <w:rFonts w:ascii="Calibri" w:hAnsi="Calibri" w:eastAsia="Calibri"/>
-          <w:b w:val="0"/>
-          <w:color w:val="000000"/>
-          <w:sz w:val="22"/>
-        </w:rPr>
-        <w:t>BSc (Hons) Software Engineering</w:t>
-      </w:r>
-      <w:r>
-        <w:rPr>
-          <w:rFonts w:ascii="Calibri" w:hAnsi="Calibri" w:eastAsia="Calibri"/>
-          <w:b w:val="0"/>
-          <w:color w:val="7F7F7F"/>
-          <w:sz w:val="20"/>
-        </w:rPr>
-        <w:t xml:space="preserve">  Sep 2021 - 2025</w:t>
       </w:r>
     </w:p>
     <w:p>
@@ -907,323 +1154,6 @@
         </w:rPr>
         <w:t xml:space="preserve">  Jan 2019 - Jun 2021</w:t>
       </w:r>
-    </w:p>
-    <w:p>
-      <w:pPr>
-        <w:spacing w:after="0"/>
-      </w:pPr>
-      <w:r>
-        <w:rPr>
-          <w:rFonts w:ascii="Calibri" w:hAnsi="Calibri" w:eastAsia="Calibri"/>
-          <w:b w:val="0"/>
-          <w:color w:val="000000"/>
-          <w:sz w:val="22"/>
-        </w:rPr>
-        <w:t>School Certificate</w:t>
-      </w:r>
-      <w:r>
-        <w:rPr>
-          <w:rFonts w:ascii="Calibri" w:hAnsi="Calibri" w:eastAsia="Calibri"/>
-          <w:b w:val="0"/>
-          <w:color w:val="7F7F7F"/>
-          <w:sz w:val="20"/>
-        </w:rPr>
-        <w:t xml:space="preserve">  Jan 2017 - Nov 2018</w:t>
-      </w:r>
-    </w:p>
-    <w:p>
-      <w:pPr>
-        <w:spacing w:before="80" w:after="0"/>
-      </w:pPr>
-      <w:r>
-        <w:rPr>
-          <w:rFonts w:ascii="Calibri" w:hAnsi="Calibri" w:eastAsia="Calibri"/>
-          <w:b/>
-          <w:color w:val="000000"/>
-          <w:sz w:val="22"/>
-        </w:rPr>
-        <w:t>Wisdom In Tech</w:t>
-      </w:r>
-    </w:p>
-    <w:p>
-      <w:pPr>
-        <w:spacing w:after="0"/>
-      </w:pPr>
-      <w:r>
-        <w:rPr>
-          <w:rFonts w:ascii="Calibri" w:hAnsi="Calibri" w:eastAsia="Calibri"/>
-          <w:b w:val="0"/>
-          <w:color w:val="000000"/>
-          <w:sz w:val="22"/>
-        </w:rPr>
-        <w:t>Multimedia Technologies</w:t>
-      </w:r>
-      <w:r>
-        <w:rPr>
-          <w:rFonts w:ascii="Calibri" w:hAnsi="Calibri" w:eastAsia="Calibri"/>
-          <w:b w:val="0"/>
-          <w:color w:val="7F7F7F"/>
-          <w:sz w:val="20"/>
-        </w:rPr>
-        <w:t xml:space="preserve">  May 2018 - Apr 2019</w:t>
-      </w:r>
-    </w:p>
-    <w:p>
-      <w:pPr>
-        <w:spacing w:after="0"/>
-      </w:pPr>
-      <w:r>
-        <w:rPr>
-          <w:rFonts w:ascii="Calibri" w:hAnsi="Calibri" w:eastAsia="Calibri"/>
-          <w:b w:val="0"/>
-          <w:color w:val="000000"/>
-          <w:sz w:val="22"/>
-        </w:rPr>
-        <w:t>Graphic Technologies</w:t>
-      </w:r>
-      <w:r>
-        <w:rPr>
-          <w:rFonts w:ascii="Calibri" w:hAnsi="Calibri" w:eastAsia="Calibri"/>
-          <w:b w:val="0"/>
-          <w:color w:val="7F7F7F"/>
-          <w:sz w:val="20"/>
-        </w:rPr>
-        <w:t xml:space="preserve">  Sep 2017 - Jun 2018</w:t>
-      </w:r>
-    </w:p>
-    <w:p>
-      <w:pPr>
-        <w:spacing w:after="0"/>
-      </w:pPr>
-      <w:r>
-        <w:rPr>
-          <w:rFonts w:ascii="Calibri" w:hAnsi="Calibri" w:eastAsia="Calibri"/>
-          <w:b w:val="0"/>
-          <w:color w:val="000000"/>
-          <w:sz w:val="22"/>
-        </w:rPr>
-        <w:t>Office Applications, Advanced</w:t>
-      </w:r>
-      <w:r>
-        <w:rPr>
-          <w:rFonts w:ascii="Calibri" w:hAnsi="Calibri" w:eastAsia="Calibri"/>
-          <w:b w:val="0"/>
-          <w:color w:val="7F7F7F"/>
-          <w:sz w:val="20"/>
-        </w:rPr>
-        <w:t xml:space="preserve">  Jan 2017 - Aug 2017</w:t>
-      </w:r>
-    </w:p>
-    <w:p>
-      <w:pPr>
-        <w:spacing w:after="0"/>
-      </w:pPr>
-      <w:r>
-        <w:rPr>
-          <w:rFonts w:ascii="Calibri" w:hAnsi="Calibri" w:eastAsia="Calibri"/>
-          <w:b w:val="0"/>
-          <w:color w:val="000000"/>
-          <w:sz w:val="22"/>
-        </w:rPr>
-        <w:t>Office Applications, Intermediate</w:t>
-      </w:r>
-      <w:r>
-        <w:rPr>
-          <w:rFonts w:ascii="Calibri" w:hAnsi="Calibri" w:eastAsia="Calibri"/>
-          <w:b w:val="0"/>
-          <w:color w:val="7F7F7F"/>
-          <w:sz w:val="20"/>
-        </w:rPr>
-        <w:t xml:space="preserve">  May 2016 - Dec 2016</w:t>
-      </w:r>
-    </w:p>
-    <w:p>
-      <w:pPr>
-        <w:spacing w:after="0"/>
-      </w:pPr>
-      <w:r>
-        <w:rPr>
-          <w:rFonts w:ascii="Calibri" w:hAnsi="Calibri" w:eastAsia="Calibri"/>
-          <w:b w:val="0"/>
-          <w:color w:val="000000"/>
-          <w:sz w:val="22"/>
-        </w:rPr>
-        <w:t>ICT Principle</w:t>
-      </w:r>
-      <w:r>
-        <w:rPr>
-          <w:rFonts w:ascii="Calibri" w:hAnsi="Calibri" w:eastAsia="Calibri"/>
-          <w:b w:val="0"/>
-          <w:color w:val="7F7F7F"/>
-          <w:sz w:val="20"/>
-        </w:rPr>
-        <w:t xml:space="preserve">  Sep 2015 - Apr 2016</w:t>
-      </w:r>
-    </w:p>
-    <w:p>
-      <w:pPr>
-        <w:spacing w:before="240" w:after="80"/>
-      </w:pPr>
-      <w:r>
-        <w:rPr>
-          <w:rFonts w:ascii="Calibri" w:hAnsi="Calibri" w:eastAsia="Calibri"/>
-          <w:b/>
-          <w:color w:val="0B769F"/>
-          <w:sz w:val="22"/>
-        </w:rPr>
-        <w:t>LANGUAGES</w:t>
-      </w:r>
-    </w:p>
-    <w:p>
-      <w:pPr>
-        <w:spacing w:before="60" w:after="0"/>
-      </w:pPr>
-      <w:r>
-        <w:rPr>
-          <w:rFonts w:ascii="Calibri" w:hAnsi="Calibri" w:eastAsia="Calibri"/>
-          <w:b/>
-          <w:color w:val="000000"/>
-          <w:sz w:val="22"/>
-        </w:rPr>
-        <w:t xml:space="preserve">Fluent languages: </w:t>
-      </w:r>
-      <w:r>
-        <w:rPr>
-          <w:rFonts w:ascii="Calibri" w:hAnsi="Calibri" w:eastAsia="Calibri"/>
-          <w:b w:val="0"/>
-          <w:color w:val="000000"/>
-          <w:sz w:val="22"/>
-        </w:rPr>
-        <w:t>English, French, Creole</w:t>
-      </w:r>
-    </w:p>
-    <w:p>
-      <w:pPr>
-        <w:spacing w:before="320" w:after="40"/>
-        <w:pBdr>
-          <w:top w:val="single" w:sz="6" w:space="8" w:color="CCCCCC"/>
-        </w:pBdr>
-      </w:pPr>
-      <w:r>
-        <w:rPr>
-          <w:rFonts w:ascii="Calibri" w:hAnsi="Calibri" w:eastAsia="Calibri"/>
-          <w:b/>
-          <w:color w:val="000000"/>
-          <w:sz w:val="20"/>
-        </w:rPr>
-        <w:t>Contact</w:t>
-      </w:r>
-    </w:p>
-    <w:p>
-      <w:pPr>
-        <w:spacing w:before="0" w:after="0"/>
-      </w:pPr>
-      <w:r>
-        <w:rPr>
-          <w:rFonts w:ascii="Calibri" w:hAnsi="Calibri" w:eastAsia="Calibri"/>
-          <w:b w:val="0"/>
-          <w:color w:val="7F7F7F"/>
-          <w:sz w:val="20"/>
-        </w:rPr>
-        <w:t>Vacoas, Mauritius</w:t>
-      </w:r>
-    </w:p>
-    <w:p>
-      <w:pPr>
-        <w:spacing w:before="0" w:after="0"/>
-      </w:pPr>
-      <w:hyperlink r:id="rId12">
-        <w:r>
-          <w:rPr>
-            <w:color w:val="7F7F7F"/>
-            <w:u w:val="single"/>
-            <w:sz w:val="20"/>
-            <w:szCs w:val="20"/>
-            <w:rFonts w:ascii="Calibri" w:hAnsi="Calibri" w:eastAsia="Calibri"/>
-          </w:rPr>
-          <w:t>kibee0506@gmail.com</w:t>
-        </w:r>
-      </w:hyperlink>
-      <w:r>
-        <w:rPr>
-          <w:rFonts w:ascii="Calibri" w:hAnsi="Calibri" w:eastAsia="Calibri"/>
-          <w:b w:val="0"/>
-          <w:color w:val="7F7F7F"/>
-          <w:sz w:val="20"/>
-        </w:rPr>
-        <w:t xml:space="preserve">  |  </w:t>
-      </w:r>
-      <w:hyperlink r:id="rId13">
-        <w:r>
-          <w:rPr>
-            <w:color w:val="7F7F7F"/>
-            <w:u w:val="single"/>
-            <w:sz w:val="20"/>
-            <w:szCs w:val="20"/>
-            <w:rFonts w:ascii="Calibri" w:hAnsi="Calibri" w:eastAsia="Calibri"/>
-          </w:rPr>
-          <w:t>+230 5905 4115</w:t>
-        </w:r>
-      </w:hyperlink>
-    </w:p>
-    <w:p>
-      <w:pPr>
-        <w:spacing w:before="0" w:after="0"/>
-      </w:pPr>
-      <w:hyperlink r:id="rId14">
-        <w:r>
-          <w:rPr>
-            <w:color w:val="7F7F7F"/>
-            <w:u w:val="single"/>
-            <w:sz w:val="20"/>
-            <w:szCs w:val="20"/>
-            <w:rFonts w:ascii="Calibri" w:hAnsi="Calibri" w:eastAsia="Calibri"/>
-          </w:rPr>
-          <w:t>linkedin.com/in/ksobhee</w:t>
-        </w:r>
-      </w:hyperlink>
-      <w:r>
-        <w:rPr>
-          <w:rFonts w:ascii="Calibri" w:hAnsi="Calibri" w:eastAsia="Calibri"/>
-          <w:b w:val="0"/>
-          <w:color w:val="7F7F7F"/>
-          <w:sz w:val="20"/>
-        </w:rPr>
-        <w:t xml:space="preserve">  |  </w:t>
-      </w:r>
-      <w:hyperlink r:id="rId15">
-        <w:r>
-          <w:rPr>
-            <w:color w:val="7F7F7F"/>
-            <w:u w:val="single"/>
-            <w:sz w:val="20"/>
-            <w:szCs w:val="20"/>
-            <w:rFonts w:ascii="Calibri" w:hAnsi="Calibri" w:eastAsia="Calibri"/>
-          </w:rPr>
-          <w:t>github.com/Kishan-1000101</w:t>
-        </w:r>
-      </w:hyperlink>
-      <w:r>
-        <w:rPr>
-          <w:rFonts w:ascii="Calibri" w:hAnsi="Calibri" w:eastAsia="Calibri"/>
-          <w:b w:val="0"/>
-          <w:color w:val="7F7F7F"/>
-          <w:sz w:val="20"/>
-        </w:rPr>
-        <w:t xml:space="preserve">  |  </w:t>
-      </w:r>
-      <w:hyperlink r:id="rId16">
-        <w:r>
-          <w:rPr>
-            <w:color w:val="7F7F7F"/>
-            <w:u w:val="single"/>
-            <w:sz w:val="20"/>
-            <w:szCs w:val="20"/>
-            <w:rFonts w:ascii="Calibri" w:hAnsi="Calibri" w:eastAsia="Calibri"/>
-          </w:rPr>
-          <w:t>kishan-1000101.github.io/portfolio</w:t>
-        </w:r>
-      </w:hyperlink>
     </w:p>
     <w:sectPr>
       <w:pgSz w:w="12240" w:h="15840"/>

</xml_diff>

<commit_message>
CV: Experience section + broader AI summary
Co-authored-by: Cursor <cursoragent@cursor.com>
</commit_message>
<xml_diff>
--- a/cv/Kishan-Sobhee-Resume.docx
+++ b/cv/Kishan-Sobhee-Resume.docx
@@ -144,7 +144,7 @@
           <w:color w:val="000000"/>
           <w:sz w:val="22"/>
         </w:rPr>
-        <w:t>Full-stack developer with 3+ years delivering production systems in Laravel and React, from multi-tenant SaaS to marketplaces and booking platforms. Works with AI-assisted development (Cursor) and ships AI features such as a customer support chatbot and camera OCR onboarding. Sole developer on KeyCars, a car rental SaaS, and project manager on ZilMall, a Mauritius multi-vendor marketplace, owning scope, release priorities and stakeholder communication. Has delivered for local and international clients across Europe, the Indian Ocean and Australasia. Open to full-time or contract roles, remote or hybrid. Based in Mauritius (GMT+4).</w:t>
+        <w:t>Full-stack developer with 3+ years delivering production systems in Laravel and React, from multi-tenant SaaS to marketplaces and booking platforms. Works with AI-assisted development (Cursor) and has shipped production AI features (automation, OCR, chatbots). Sole developer on KeyCars, a car rental SaaS, and project manager on ZilMall, a Mauritius multi-vendor marketplace, owning scope, release priorities and stakeholder communication. Has delivered for local and international clients across Europe, the Indian Ocean and Australasia. Open to full-time or contract roles, remote or hybrid. Based in Mauritius (GMT+4).</w:t>
       </w:r>
     </w:p>
     <w:p>
@@ -266,7 +266,7 @@
           <w:color w:val="0B769F"/>
           <w:sz w:val="22"/>
         </w:rPr>
-        <w:t>FREELANCE</w:t>
+        <w:t>EXPERIENCE</w:t>
       </w:r>
     </w:p>
     <w:p>
@@ -280,7 +280,7 @@
           <w:color w:val="000000"/>
           <w:sz w:val="22"/>
         </w:rPr>
-        <w:t>Current clients: ZilMall, MR Production and Agence ISCL (Linar), on contract since the full-time role below ended.</w:t>
+        <w:t>Current contract clients: ZilMall, MR Production and Agence ISCL (Linar). Full-time and part-time roles follow.</w:t>
       </w:r>
     </w:p>
     <w:p>
@@ -304,7 +304,7 @@
           <w:color w:val="7F7F7F"/>
           <w:sz w:val="20"/>
         </w:rPr>
-        <w:t xml:space="preserve"> | Oct 2025 - Present · Mauritius · Hybrid</w:t>
+        <w:t xml:space="preserve"> | Mauritius · Hybrid</w:t>
       </w:r>
       <w:r>
         <w:rPr>
@@ -341,6 +341,21 @@
           <w:sz w:val="22"/>
         </w:rPr>
         <w:t>Full Stack Developer &amp; Project Manager</w:t>
+      </w:r>
+    </w:p>
+    <w:p>
+      <w:pPr>
+        <w:keepNext/>
+        <w:spacing w:before="0" w:after="40"/>
+      </w:pPr>
+      <w:r>
+        <w:rPr>
+          <w:rFonts w:ascii="Calibri" w:hAnsi="Calibri" w:eastAsia="Calibri"/>
+          <w:b w:val="0"/>
+          <w:color w:val="7F7F7F"/>
+          <w:sz w:val="20"/>
+        </w:rPr>
+        <w:t>Contract · Oct 2025 - Present</w:t>
       </w:r>
     </w:p>
     <w:p>
@@ -412,7 +427,7 @@
           <w:color w:val="7F7F7F"/>
           <w:sz w:val="20"/>
         </w:rPr>
-        <w:t xml:space="preserve"> | Feb 2026 - Present · Remote</w:t>
+        <w:t xml:space="preserve"> | Remote</w:t>
       </w:r>
       <w:r>
         <w:rPr>
@@ -449,6 +464,21 @@
           <w:sz w:val="22"/>
         </w:rPr>
         <w:t>Full Stack Developer</w:t>
+      </w:r>
+    </w:p>
+    <w:p>
+      <w:pPr>
+        <w:keepNext/>
+        <w:spacing w:before="0" w:after="40"/>
+      </w:pPr>
+      <w:r>
+        <w:rPr>
+          <w:rFonts w:ascii="Calibri" w:hAnsi="Calibri" w:eastAsia="Calibri"/>
+          <w:b w:val="0"/>
+          <w:color w:val="7F7F7F"/>
+          <w:sz w:val="20"/>
+        </w:rPr>
+        <w:t>Contract · Feb 2026 - Present</w:t>
       </w:r>
     </w:p>
     <w:p>
@@ -511,7 +541,7 @@
           <w:color w:val="000000"/>
           <w:sz w:val="22"/>
         </w:rPr>
-        <w:t>Agileum</w:t>
+        <w:t>Agence ISCL (Linar)</w:t>
       </w:r>
       <w:r>
         <w:rPr>
@@ -520,7 +550,7 @@
           <w:color w:val="7F7F7F"/>
           <w:sz w:val="20"/>
         </w:rPr>
-        <w:t xml:space="preserve"> | Oct 2025 - Apr 2026 · Mauritius · Remote</w:t>
+        <w:t xml:space="preserve"> | Réunion · Remote</w:t>
       </w:r>
     </w:p>
     <w:p>
@@ -535,7 +565,22 @@
           <w:color w:val="000000"/>
           <w:sz w:val="22"/>
         </w:rPr>
-        <w:t>Full Stack Web Developer</w:t>
+        <w:t>Full Stack Developer</w:t>
+      </w:r>
+    </w:p>
+    <w:p>
+      <w:pPr>
+        <w:keepNext/>
+        <w:spacing w:before="0" w:after="40"/>
+      </w:pPr>
+      <w:r>
+        <w:rPr>
+          <w:rFonts w:ascii="Calibri" w:hAnsi="Calibri" w:eastAsia="Calibri"/>
+          <w:b w:val="0"/>
+          <w:color w:val="7F7F7F"/>
+          <w:sz w:val="20"/>
+        </w:rPr>
+        <w:t>Contract · Sep 2026 - Present</w:t>
       </w:r>
     </w:p>
     <w:p>
@@ -551,122 +596,7 @@
           <w:color w:val="000000"/>
           <w:sz w:val="22"/>
         </w:rPr>
-        <w:t>Contract continuation of client work from the full-time role: new features, integrations and production fixes.</w:t>
-      </w:r>
-    </w:p>
-    <w:p>
-      <w:pPr>
-        <w:keepNext/>
-        <w:spacing w:before="160" w:after="20"/>
-      </w:pPr>
-      <w:r>
-        <w:rPr>
-          <w:rFonts w:ascii="Calibri" w:hAnsi="Calibri" w:eastAsia="Calibri"/>
-          <w:b/>
-          <w:color w:val="000000"/>
-          <w:sz w:val="22"/>
-        </w:rPr>
-        <w:t>Safyr Utilis</w:t>
-      </w:r>
-      <w:r>
-        <w:rPr>
-          <w:rFonts w:ascii="Calibri" w:hAnsi="Calibri" w:eastAsia="Calibri"/>
-          <w:b w:val="0"/>
-          <w:color w:val="7F7F7F"/>
-          <w:sz w:val="20"/>
-        </w:rPr>
-        <w:t xml:space="preserve"> | Feb 2025 - Nov 2025 · Remote</w:t>
-      </w:r>
-      <w:r>
-        <w:rPr>
-          <w:rFonts w:ascii="Calibri" w:hAnsi="Calibri" w:eastAsia="Calibri"/>
-          <w:b w:val="0"/>
-          <w:color w:val="7F7F7F"/>
-          <w:sz w:val="20"/>
-        </w:rPr>
-        <w:t xml:space="preserve"> · </w:t>
-      </w:r>
-      <w:hyperlink r:id="rId15">
-        <w:r>
-          <w:rPr>
-            <w:color w:val="7F7F7F"/>
-            <w:u w:val="single"/>
-            <w:sz w:val="20"/>
-            <w:szCs w:val="20"/>
-            <w:rFonts w:ascii="Calibri" w:hAnsi="Calibri" w:eastAsia="Calibri"/>
-          </w:rPr>
-          <w:t>syul.mu</w:t>
-        </w:r>
-      </w:hyperlink>
-    </w:p>
-    <w:p>
-      <w:pPr>
-        <w:keepNext/>
-        <w:spacing w:before="80" w:after="0"/>
-      </w:pPr>
-      <w:r>
-        <w:rPr>
-          <w:rFonts w:ascii="Calibri" w:hAnsi="Calibri" w:eastAsia="Calibri"/>
-          <w:b/>
-          <w:color w:val="000000"/>
-          <w:sz w:val="22"/>
-        </w:rPr>
-        <w:t>Web Developer</w:t>
-      </w:r>
-    </w:p>
-    <w:p>
-      <w:pPr>
-        <w:pStyle w:val="ListBullet"/>
-        <w:spacing w:before="0" w:after="20"/>
-        <w:ind w:left="360"/>
-      </w:pPr>
-      <w:r>
-        <w:rPr>
-          <w:rFonts w:ascii="Calibri" w:hAnsi="Calibri" w:eastAsia="Calibri"/>
-          <w:b w:val="0"/>
-          <w:color w:val="000000"/>
-          <w:sz w:val="22"/>
-        </w:rPr>
-        <w:t>Designed, built and deployed the company website as sole developer, with a responsive layout the team edits itself after handover.</w:t>
-      </w:r>
-    </w:p>
-    <w:p>
-      <w:pPr>
-        <w:keepNext/>
-        <w:spacing w:before="240" w:after="80"/>
-      </w:pPr>
-      <w:r>
-        <w:rPr>
-          <w:rFonts w:ascii="Calibri" w:hAnsi="Calibri" w:eastAsia="Calibri"/>
-          <w:b/>
-          <w:color w:val="0B769F"/>
-          <w:sz w:val="22"/>
-        </w:rPr>
-        <w:t>EMPLOYMENT</w:t>
-      </w:r>
-    </w:p>
-    <w:p>
-      <w:pPr>
-        <w:keepNext/>
-        <w:spacing w:before="160" w:after="20"/>
-      </w:pPr>
-      <w:r>
-        <w:rPr>
-          <w:rFonts w:ascii="Calibri" w:hAnsi="Calibri" w:eastAsia="Calibri"/>
-          <w:b/>
-          <w:color w:val="000000"/>
-          <w:sz w:val="22"/>
-        </w:rPr>
-        <w:t>Agence ISCL (Linar)</w:t>
-      </w:r>
-      <w:r>
-        <w:rPr>
-          <w:rFonts w:ascii="Calibri" w:hAnsi="Calibri" w:eastAsia="Calibri"/>
-          <w:b w:val="0"/>
-          <w:color w:val="7F7F7F"/>
-          <w:sz w:val="20"/>
-        </w:rPr>
-        <w:t xml:space="preserve"> | Réunion · Remote</w:t>
+        <w:t>Continued with the agency on contract after the full-time role for upcoming product work.</w:t>
       </w:r>
     </w:p>
     <w:p>
@@ -861,6 +791,52 @@
           <w:color w:val="000000"/>
           <w:sz w:val="22"/>
         </w:rPr>
+        <w:t>Full Stack Web Developer</w:t>
+      </w:r>
+    </w:p>
+    <w:p>
+      <w:pPr>
+        <w:keepNext/>
+        <w:spacing w:before="0" w:after="40"/>
+      </w:pPr>
+      <w:r>
+        <w:rPr>
+          <w:rFonts w:ascii="Calibri" w:hAnsi="Calibri" w:eastAsia="Calibri"/>
+          <w:b w:val="0"/>
+          <w:color w:val="7F7F7F"/>
+          <w:sz w:val="20"/>
+        </w:rPr>
+        <w:t>Contract · Oct 2025 - Apr 2026</w:t>
+      </w:r>
+    </w:p>
+    <w:p>
+      <w:pPr>
+        <w:pStyle w:val="ListBullet"/>
+        <w:spacing w:before="0" w:after="20"/>
+        <w:ind w:left="360"/>
+      </w:pPr>
+      <w:r>
+        <w:rPr>
+          <w:rFonts w:ascii="Calibri" w:hAnsi="Calibri" w:eastAsia="Calibri"/>
+          <w:b w:val="0"/>
+          <w:color w:val="000000"/>
+          <w:sz w:val="22"/>
+        </w:rPr>
+        <w:t>Contract continuation of client work from the full-time role: new features, integrations and production fixes.</w:t>
+      </w:r>
+    </w:p>
+    <w:p>
+      <w:pPr>
+        <w:keepNext/>
+        <w:spacing w:before="80" w:after="0"/>
+      </w:pPr>
+      <w:r>
+        <w:rPr>
+          <w:rFonts w:ascii="Calibri" w:hAnsi="Calibri" w:eastAsia="Calibri"/>
+          <w:b/>
+          <w:color w:val="000000"/>
+          <w:sz w:val="22"/>
+        </w:rPr>
         <w:t>Associate Software Engineer</w:t>
       </w:r>
     </w:p>
@@ -925,6 +901,97 @@
           <w:sz w:val="22"/>
         </w:rPr>
         <w:t>Set up deployments with Docker, Nginx and Jenkins, and supported a .NET Core migration.</w:t>
+      </w:r>
+    </w:p>
+    <w:p>
+      <w:pPr>
+        <w:keepNext/>
+        <w:spacing w:before="160" w:after="20"/>
+      </w:pPr>
+      <w:r>
+        <w:rPr>
+          <w:rFonts w:ascii="Calibri" w:hAnsi="Calibri" w:eastAsia="Calibri"/>
+          <w:b/>
+          <w:color w:val="000000"/>
+          <w:sz w:val="22"/>
+        </w:rPr>
+        <w:t>Safyr Utilis</w:t>
+      </w:r>
+      <w:r>
+        <w:rPr>
+          <w:rFonts w:ascii="Calibri" w:hAnsi="Calibri" w:eastAsia="Calibri"/>
+          <w:b w:val="0"/>
+          <w:color w:val="7F7F7F"/>
+          <w:sz w:val="20"/>
+        </w:rPr>
+        <w:t xml:space="preserve"> | Remote</w:t>
+      </w:r>
+      <w:r>
+        <w:rPr>
+          <w:rFonts w:ascii="Calibri" w:hAnsi="Calibri" w:eastAsia="Calibri"/>
+          <w:b w:val="0"/>
+          <w:color w:val="7F7F7F"/>
+          <w:sz w:val="20"/>
+        </w:rPr>
+        <w:t xml:space="preserve"> · </w:t>
+      </w:r>
+      <w:hyperlink r:id="rId15">
+        <w:r>
+          <w:rPr>
+            <w:color w:val="7F7F7F"/>
+            <w:u w:val="single"/>
+            <w:sz w:val="20"/>
+            <w:szCs w:val="20"/>
+            <w:rFonts w:ascii="Calibri" w:hAnsi="Calibri" w:eastAsia="Calibri"/>
+          </w:rPr>
+          <w:t>syul.mu</w:t>
+        </w:r>
+      </w:hyperlink>
+    </w:p>
+    <w:p>
+      <w:pPr>
+        <w:keepNext/>
+        <w:spacing w:before="80" w:after="0"/>
+      </w:pPr>
+      <w:r>
+        <w:rPr>
+          <w:rFonts w:ascii="Calibri" w:hAnsi="Calibri" w:eastAsia="Calibri"/>
+          <w:b/>
+          <w:color w:val="000000"/>
+          <w:sz w:val="22"/>
+        </w:rPr>
+        <w:t>Web Developer</w:t>
+      </w:r>
+    </w:p>
+    <w:p>
+      <w:pPr>
+        <w:keepNext/>
+        <w:spacing w:before="0" w:after="40"/>
+      </w:pPr>
+      <w:r>
+        <w:rPr>
+          <w:rFonts w:ascii="Calibri" w:hAnsi="Calibri" w:eastAsia="Calibri"/>
+          <w:b w:val="0"/>
+          <w:color w:val="7F7F7F"/>
+          <w:sz w:val="20"/>
+        </w:rPr>
+        <w:t>Contract · Feb 2025 - Nov 2025</w:t>
+      </w:r>
+    </w:p>
+    <w:p>
+      <w:pPr>
+        <w:pStyle w:val="ListBullet"/>
+        <w:spacing w:before="0" w:after="20"/>
+        <w:ind w:left="360"/>
+      </w:pPr>
+      <w:r>
+        <w:rPr>
+          <w:rFonts w:ascii="Calibri" w:hAnsi="Calibri" w:eastAsia="Calibri"/>
+          <w:b w:val="0"/>
+          <w:color w:val="000000"/>
+          <w:sz w:val="22"/>
+        </w:rPr>
+        <w:t>Designed, built and deployed the company website as sole developer, with a responsive layout the team edits itself after handover.</w:t>
       </w:r>
     </w:p>
     <w:p>

</xml_diff>

<commit_message>
CV download: updated master CV
Co-authored-by: Cursor <cursoragent@cursor.com>
</commit_message>
<xml_diff>
--- a/cv/Kishan-Sobhee-Resume.docx
+++ b/cv/Kishan-Sobhee-Resume.docx
@@ -29,7 +29,7 @@
           <w:color w:val="0B769F"/>
           <w:sz w:val="28"/>
         </w:rPr>
-        <w:t>Full Stack Developer</w:t>
+        <w:t>Full Stack Developer · Laravel &amp; React</w:t>
       </w:r>
     </w:p>
     <w:p>
@@ -43,7 +43,7 @@
           <w:color w:val="7F7F7F"/>
           <w:sz w:val="20"/>
         </w:rPr>
-        <w:t xml:space="preserve">Vacoas, Mauritius  |  </w:t>
+        <w:t xml:space="preserve">Vacoas, Mauritius (GMT+4)  |  </w:t>
       </w:r>
       <w:hyperlink r:id="rId9">
         <w:r>
@@ -144,7 +144,7 @@
           <w:color w:val="000000"/>
           <w:sz w:val="22"/>
         </w:rPr>
-        <w:t>Full-stack developer with 3+ years delivering production systems in Laravel and React, from multi-tenant SaaS to marketplaces and booking platforms. Works with AI-assisted development (Cursor) and has shipped production AI features (automation, OCR, chatbots). Sole developer on KeyCars, a car rental SaaS, and project manager on ZilMall, a Mauritius multi-vendor marketplace, owning scope, release priorities and stakeholder communication. Has delivered for local and international clients across Europe, the Indian Ocean and Australasia. Open to full-time or contract roles, remote or hybrid. Based in Mauritius (GMT+4).</w:t>
+        <w:t>Full-stack developer with 3+ years of experience delivering production systems in Laravel and React, from multi-tenant SaaS to marketplaces and booking platforms. Sole developer of KeyCars, a car rental SaaS with 50+ domain models, and project manager and co-developer of ZilMall, a Mauritius multi-vendor marketplace. Ships production AI features (OCR, automation, chatbots) and uses AI-assisted development (Cursor) with code review of every change, automated tests, manual testing and staging before release. Earlier enterprise experience in Salesforce (Apex, SOQL), Oracle PL/SQL and .NET. Manages several client projects concurrently for clients across Europe, the Indian Ocean and Australasia. Open to full-time or contract roles, remote or hybrid.</w:t>
       </w:r>
     </w:p>
     <w:p>
@@ -173,7 +173,7 @@
           <w:color w:val="000000"/>
           <w:sz w:val="22"/>
         </w:rPr>
-        <w:t xml:space="preserve">Daily: </w:t>
+        <w:t xml:space="preserve">Core: </w:t>
       </w:r>
       <w:r>
         <w:rPr>
@@ -205,7 +205,7 @@
           <w:color w:val="000000"/>
           <w:sz w:val="22"/>
         </w:rPr>
-        <w:t>Node.js, Python, Supabase/PostgreSQL, WordPress, MUI, n8n, OCR/PDF automation, Docker, Nginx, Jenkins, OVH/Linux, Jira</w:t>
+        <w:t>Node.js, Python, Supabase/PostgreSQL, WordPress, n8n, OCR and PDF automation, Docker, Nginx, Jenkins, Linux/OVH, Jira</w:t>
       </w:r>
     </w:p>
     <w:p>
@@ -219,7 +219,7 @@
           <w:color w:val="000000"/>
           <w:sz w:val="22"/>
         </w:rPr>
-        <w:t xml:space="preserve">Earlier: </w:t>
+        <w:t xml:space="preserve">Enterprise and other: </w:t>
       </w:r>
       <w:r>
         <w:rPr>
@@ -228,7 +228,7 @@
           <w:color w:val="000000"/>
           <w:sz w:val="22"/>
         </w:rPr>
-        <w:t>.NET / C# / ASP.NET, Salesforce (Apex, SOQL, Flows, Omnistudio), Oracle/PL/SQL, Angular/AngularJS, Drupal, MongoDB, Flutter/Android</w:t>
+        <w:t>.NET / C#, Salesforce (Apex, SOQL, Flows, Omnistudio), Oracle PL/SQL, Angular, Drupal, MongoDB, Flutter</w:t>
       </w:r>
     </w:p>
     <w:p>
@@ -271,6 +271,30 @@
     </w:p>
     <w:p>
       <w:pPr>
+        <w:keepNext/>
+        <w:spacing w:before="160" w:after="20"/>
+      </w:pPr>
+      <w:r>
+        <w:rPr>
+          <w:rFonts w:ascii="Calibri" w:hAnsi="Calibri" w:eastAsia="Calibri"/>
+          <w:b/>
+          <w:color w:val="000000"/>
+          <w:sz w:val="22"/>
+        </w:rPr>
+        <w:t>Freelance Full Stack Developer</w:t>
+      </w:r>
+      <w:r>
+        <w:rPr>
+          <w:rFonts w:ascii="Calibri" w:hAnsi="Calibri" w:eastAsia="Calibri"/>
+          <w:b w:val="0"/>
+          <w:color w:val="7F7F7F"/>
+          <w:sz w:val="20"/>
+        </w:rPr>
+        <w:t xml:space="preserve"> | 2025 – Present</w:t>
+      </w:r>
+    </w:p>
+    <w:p>
+      <w:pPr>
         <w:spacing w:before="40" w:after="40"/>
       </w:pPr>
       <w:r>
@@ -280,7 +304,7 @@
           <w:color w:val="000000"/>
           <w:sz w:val="22"/>
         </w:rPr>
-        <w:t>Current contract clients: ZilMall, MR Production and Agence ISCL (Linar). Full-time and part-time roles follow.</w:t>
+        <w:t>Independent practice serving several clients concurrently, managed through clear scheduling and prioritisation. ISCL ran on fixed weekly hours; other engagements were deadline-based. Gather requirements directly with each client and own delivery from scope to production.</w:t>
       </w:r>
     </w:p>
     <w:p>
@@ -295,7 +319,7 @@
           <w:color w:val="000000"/>
           <w:sz w:val="22"/>
         </w:rPr>
-        <w:t>ZilMall</w:t>
+        <w:t>Agence ISCL (Réunion), client</w:t>
       </w:r>
       <w:r>
         <w:rPr>
@@ -304,7 +328,110 @@
           <w:color w:val="7F7F7F"/>
           <w:sz w:val="20"/>
         </w:rPr>
-        <w:t xml:space="preserve"> | Mauritius · Hybrid</w:t>
+        <w:t xml:space="preserve"> | Jun 2025 – Present</w:t>
+      </w:r>
+    </w:p>
+    <w:p>
+      <w:pPr>
+        <w:keepNext/>
+        <w:spacing w:before="0" w:after="40"/>
+      </w:pPr>
+      <w:r>
+        <w:rPr>
+          <w:rFonts w:ascii="Calibri" w:hAnsi="Calibri" w:eastAsia="Calibri"/>
+          <w:b w:val="0"/>
+          <w:color w:val="7F7F7F"/>
+          <w:sz w:val="20"/>
+        </w:rPr>
+        <w:t>Freelance engagement: about 20 hrs/week (evenings and weekends) from Jun 2025, about 40 hrs/week (weekdays) from Oct 2025 to Sep 2026, then ongoing on a contract basis for upcoming product work.</w:t>
+      </w:r>
+    </w:p>
+    <w:p>
+      <w:pPr>
+        <w:pStyle w:val="ListBullet"/>
+        <w:spacing w:before="0" w:after="20"/>
+        <w:ind w:left="360"/>
+      </w:pPr>
+      <w:r>
+        <w:rPr>
+          <w:rFonts w:ascii="Calibri" w:hAnsi="Calibri" w:eastAsia="Calibri"/>
+          <w:b w:val="0"/>
+          <w:color w:val="000000"/>
+          <w:sz w:val="22"/>
+        </w:rPr>
+        <w:t>Built KeyCars (keycars.fr) as sole developer: a multi-tenant car rental SaaS in Laravel 12, React, TypeScript and MySQL, with 50+ domain models, company-scoped tenancy, and admin, manager and field-agent roles.</w:t>
+      </w:r>
+    </w:p>
+    <w:p>
+      <w:pPr>
+        <w:pStyle w:val="ListBullet"/>
+        <w:spacing w:before="0" w:after="20"/>
+        <w:ind w:left="360"/>
+      </w:pPr>
+      <w:r>
+        <w:rPr>
+          <w:rFonts w:ascii="Calibri" w:hAnsi="Calibri" w:eastAsia="Calibri"/>
+          <w:b w:val="0"/>
+          <w:color w:val="000000"/>
+          <w:sz w:val="22"/>
+        </w:rPr>
+        <w:t>Built a pricing engine that selects the daily rate from plans, duration tiers, packages and seasonal rates, replacing manual quote calculation.</w:t>
+      </w:r>
+    </w:p>
+    <w:p>
+      <w:pPr>
+        <w:pStyle w:val="ListBullet"/>
+        <w:spacing w:before="0" w:after="20"/>
+        <w:ind w:left="360"/>
+      </w:pPr>
+      <w:r>
+        <w:rPr>
+          <w:rFonts w:ascii="Calibri" w:hAnsi="Calibri" w:eastAsia="Calibri"/>
+          <w:b w:val="0"/>
+          <w:color w:val="000000"/>
+          <w:sz w:val="22"/>
+        </w:rPr>
+        <w:t>Automated quotes, contracts and invoices as PDFs, added camera OCR for customer records, and built vehicle inspections with damage diagrams, photos and dual signatures, so staff complete a rental in one flow instead of on paper.</w:t>
+      </w:r>
+    </w:p>
+    <w:p>
+      <w:pPr>
+        <w:pStyle w:val="ListBullet"/>
+        <w:spacing w:before="0" w:after="20"/>
+        <w:ind w:left="360"/>
+      </w:pPr>
+      <w:r>
+        <w:rPr>
+          <w:rFonts w:ascii="Calibri" w:hAnsi="Calibri" w:eastAsia="Calibri"/>
+          <w:b w:val="0"/>
+          <w:color w:val="000000"/>
+          <w:sz w:val="22"/>
+        </w:rPr>
+        <w:t>Built tracking-dashboard.fr: white-label, multi-tenant marketing dashboards (React, TypeScript, Supabase) fed by scheduled n8n workflows, replacing manually built client reports. Also delivered custom WordPress plugins and QA on rentflo.fr.</w:t>
+      </w:r>
+    </w:p>
+    <w:p>
+      <w:pPr>
+        <w:keepNext/>
+        <w:spacing w:before="160" w:after="20"/>
+      </w:pPr>
+      <w:r>
+        <w:rPr>
+          <w:rFonts w:ascii="Calibri" w:hAnsi="Calibri" w:eastAsia="Calibri"/>
+          <w:b/>
+          <w:color w:val="000000"/>
+          <w:sz w:val="22"/>
+        </w:rPr>
+        <w:t>ZilMall (Mauritius), client</w:t>
+      </w:r>
+      <w:r>
+        <w:rPr>
+          <w:rFonts w:ascii="Calibri" w:hAnsi="Calibri" w:eastAsia="Calibri"/>
+          <w:b w:val="0"/>
+          <w:color w:val="7F7F7F"/>
+          <w:sz w:val="20"/>
+        </w:rPr>
+        <w:t xml:space="preserve"> | Oct 2025 – Present</w:t>
       </w:r>
       <w:r>
         <w:rPr>
@@ -330,32 +457,18 @@
     </w:p>
     <w:p>
       <w:pPr>
-        <w:keepNext/>
-        <w:spacing w:before="80" w:after="0"/>
-      </w:pPr>
-      <w:r>
-        <w:rPr>
-          <w:rFonts w:ascii="Calibri" w:hAnsi="Calibri" w:eastAsia="Calibri"/>
-          <w:b/>
-          <w:color w:val="000000"/>
-          <w:sz w:val="22"/>
-        </w:rPr>
-        <w:t>Full Stack Developer &amp; Project Manager</w:t>
-      </w:r>
-    </w:p>
-    <w:p>
-      <w:pPr>
-        <w:keepNext/>
-        <w:spacing w:before="0" w:after="40"/>
+        <w:pStyle w:val="ListBullet"/>
+        <w:spacing w:before="0" w:after="20"/>
+        <w:ind w:left="360"/>
       </w:pPr>
       <w:r>
         <w:rPr>
           <w:rFonts w:ascii="Calibri" w:hAnsi="Calibri" w:eastAsia="Calibri"/>
           <w:b w:val="0"/>
-          <w:color w:val="7F7F7F"/>
-          <w:sz w:val="20"/>
+          <w:color w:val="000000"/>
+          <w:sz w:val="22"/>
         </w:rPr>
-        <w:t>Contract · Oct 2025 - Present</w:t>
+        <w:t>Project manager and co-developer of a multi-vendor marketplace in Laravel 12, React 19 and Inertia, with storefront, seller portal and admin in one codebase.</w:t>
       </w:r>
     </w:p>
     <w:p>
@@ -371,7 +484,7 @@
           <w:color w:val="000000"/>
           <w:sz w:val="22"/>
         </w:rPr>
-        <w:t>Project manager and co-developer, with one other developer, of a Mauritius multi-vendor marketplace in Laravel 12, React 19 and Inertia: storefront, seller portal and admin in one codebase.</w:t>
+        <w:t>Co-develop with a second developer, splitting features and reviewing each other's code, and run regular meetings with the client on scope and releases.</w:t>
       </w:r>
     </w:p>
     <w:p>
@@ -387,23 +500,7 @@
           <w:color w:val="000000"/>
           <w:sz w:val="22"/>
         </w:rPr>
-        <w:t>Built onboarding for business and individual sellers, with documents, payouts and VAT details behind admin approval queues, plus wholesale pricing.</w:t>
-      </w:r>
-    </w:p>
-    <w:p>
-      <w:pPr>
-        <w:pStyle w:val="ListBullet"/>
-        <w:spacing w:before="0" w:after="20"/>
-        <w:ind w:left="360"/>
-      </w:pPr>
-      <w:r>
-        <w:rPr>
-          <w:rFonts w:ascii="Calibri" w:hAnsi="Calibri" w:eastAsia="Calibri"/>
-          <w:b w:val="0"/>
-          <w:color w:val="000000"/>
-          <w:sz w:val="22"/>
-        </w:rPr>
-        <w:t>Own scope, release priorities and stakeholder updates. Now in soft launch, onboarding the first sellers.</w:t>
+        <w:t>Built seller onboarding for business and individual sellers, with documents, payouts and VAT details behind admin approval queues, plus wholesale pricing. Now in soft launch, onboarding the first sellers.</w:t>
       </w:r>
     </w:p>
     <w:p>
@@ -418,7 +515,7 @@
           <w:color w:val="000000"/>
           <w:sz w:val="22"/>
         </w:rPr>
-        <w:t>MR Production Co Ltd</w:t>
+        <w:t>MR Production Co Ltd (remote), client</w:t>
       </w:r>
       <w:r>
         <w:rPr>
@@ -427,7 +524,7 @@
           <w:color w:val="7F7F7F"/>
           <w:sz w:val="20"/>
         </w:rPr>
-        <w:t xml:space="preserve"> | Remote</w:t>
+        <w:t xml:space="preserve"> | Feb 2026 – Present</w:t>
       </w:r>
       <w:r>
         <w:rPr>
@@ -450,36 +547,6 @@
           <w:t>mineshramchurn.com</w:t>
         </w:r>
       </w:hyperlink>
-    </w:p>
-    <w:p>
-      <w:pPr>
-        <w:keepNext/>
-        <w:spacing w:before="80" w:after="0"/>
-      </w:pPr>
-      <w:r>
-        <w:rPr>
-          <w:rFonts w:ascii="Calibri" w:hAnsi="Calibri" w:eastAsia="Calibri"/>
-          <w:b/>
-          <w:color w:val="000000"/>
-          <w:sz w:val="22"/>
-        </w:rPr>
-        <w:t>Full Stack Developer</w:t>
-      </w:r>
-    </w:p>
-    <w:p>
-      <w:pPr>
-        <w:keepNext/>
-        <w:spacing w:before="0" w:after="40"/>
-      </w:pPr>
-      <w:r>
-        <w:rPr>
-          <w:rFonts w:ascii="Calibri" w:hAnsi="Calibri" w:eastAsia="Calibri"/>
-          <w:b w:val="0"/>
-          <w:color w:val="7F7F7F"/>
-          <w:sz w:val="20"/>
-        </w:rPr>
-        <w:t>Contract · Feb 2026 - Present</w:t>
-      </w:r>
     </w:p>
     <w:p>
       <w:pPr>
@@ -510,7 +577,7 @@
           <w:color w:val="000000"/>
           <w:sz w:val="22"/>
         </w:rPr>
-        <w:t>Replaced booking over chat with a live calendar: blocked dates, multi-day and multi-location shoots, and budget options.</w:t>
+        <w:t>Replaced booking over chat with a live calendar handling blocked dates, multi-day and multi-location shoots, and budget options.</w:t>
       </w:r>
     </w:p>
     <w:p>
@@ -526,7 +593,7 @@
           <w:color w:val="000000"/>
           <w:sz w:val="22"/>
         </w:rPr>
-        <w:t>Built a Filament admin so the studio runs bookings, crew, availability, portfolio and content itself.</w:t>
+        <w:t>Built a Filament admin so the studio manages bookings, crew, availability, portfolio and content without a developer.</w:t>
       </w:r>
     </w:p>
     <w:p>
@@ -541,7 +608,7 @@
           <w:color w:val="000000"/>
           <w:sz w:val="22"/>
         </w:rPr>
-        <w:t>Agence ISCL (Linar)</w:t>
+        <w:t>Safyr Utilis (remote), client</w:t>
       </w:r>
       <w:r>
         <w:rPr>
@@ -550,7 +617,68 @@
           <w:color w:val="7F7F7F"/>
           <w:sz w:val="20"/>
         </w:rPr>
-        <w:t xml:space="preserve"> | Réunion · Remote</w:t>
+        <w:t xml:space="preserve"> | Feb 2025 – Nov 2025</w:t>
+      </w:r>
+      <w:r>
+        <w:rPr>
+          <w:rFonts w:ascii="Calibri" w:hAnsi="Calibri" w:eastAsia="Calibri"/>
+          <w:b w:val="0"/>
+          <w:color w:val="7F7F7F"/>
+          <w:sz w:val="20"/>
+        </w:rPr>
+        <w:t xml:space="preserve"> · </w:t>
+      </w:r>
+      <w:hyperlink r:id="rId15">
+        <w:r>
+          <w:rPr>
+            <w:color w:val="7F7F7F"/>
+            <w:u w:val="single"/>
+            <w:sz w:val="20"/>
+            <w:szCs w:val="20"/>
+            <w:rFonts w:ascii="Calibri" w:hAnsi="Calibri" w:eastAsia="Calibri"/>
+          </w:rPr>
+          <w:t>syul.mu</w:t>
+        </w:r>
+      </w:hyperlink>
+    </w:p>
+    <w:p>
+      <w:pPr>
+        <w:pStyle w:val="ListBullet"/>
+        <w:spacing w:before="0" w:after="20"/>
+        <w:ind w:left="360"/>
+      </w:pPr>
+      <w:r>
+        <w:rPr>
+          <w:rFonts w:ascii="Calibri" w:hAnsi="Calibri" w:eastAsia="Calibri"/>
+          <w:b w:val="0"/>
+          <w:color w:val="000000"/>
+          <w:sz w:val="22"/>
+        </w:rPr>
+        <w:t>Designed, built and deployed the company website as sole developer, with a responsive layout the team edits itself after handover.</w:t>
+      </w:r>
+    </w:p>
+    <w:p>
+      <w:pPr>
+        <w:keepNext/>
+        <w:spacing w:before="160" w:after="20"/>
+      </w:pPr>
+      <w:r>
+        <w:rPr>
+          <w:rFonts w:ascii="Calibri" w:hAnsi="Calibri" w:eastAsia="Calibri"/>
+          <w:b/>
+          <w:color w:val="000000"/>
+          <w:sz w:val="22"/>
+        </w:rPr>
+        <w:t>Agileum (Mauritius, hybrid)</w:t>
+      </w:r>
+      <w:r>
+        <w:rPr>
+          <w:rFonts w:ascii="Calibri" w:hAnsi="Calibri" w:eastAsia="Calibri"/>
+          <w:b w:val="0"/>
+          <w:color w:val="7F7F7F"/>
+          <w:sz w:val="20"/>
+        </w:rPr>
+        <w:t xml:space="preserve"> | Jan 2025 – Apr 2026</w:t>
       </w:r>
     </w:p>
     <w:p>
@@ -565,7 +693,7 @@
           <w:color w:val="000000"/>
           <w:sz w:val="22"/>
         </w:rPr>
-        <w:t>Full Stack Developer</w:t>
+        <w:t>Associate Software Engineer (full-time)</w:t>
       </w:r>
     </w:p>
     <w:p>
@@ -580,279 +708,7 @@
           <w:color w:val="7F7F7F"/>
           <w:sz w:val="20"/>
         </w:rPr>
-        <w:t>Contract · Sep 2026 - Present</w:t>
-      </w:r>
-    </w:p>
-    <w:p>
-      <w:pPr>
-        <w:pStyle w:val="ListBullet"/>
-        <w:spacing w:before="0" w:after="20"/>
-        <w:ind w:left="360"/>
-      </w:pPr>
-      <w:r>
-        <w:rPr>
-          <w:rFonts w:ascii="Calibri" w:hAnsi="Calibri" w:eastAsia="Calibri"/>
-          <w:b w:val="0"/>
-          <w:color w:val="000000"/>
-          <w:sz w:val="22"/>
-        </w:rPr>
-        <w:t>Continued with the agency on contract after the full-time role for upcoming product work.</w:t>
-      </w:r>
-    </w:p>
-    <w:p>
-      <w:pPr>
-        <w:keepNext/>
-        <w:spacing w:before="80" w:after="0"/>
-      </w:pPr>
-      <w:r>
-        <w:rPr>
-          <w:rFonts w:ascii="Calibri" w:hAnsi="Calibri" w:eastAsia="Calibri"/>
-          <w:b/>
-          <w:color w:val="000000"/>
-          <w:sz w:val="22"/>
-        </w:rPr>
-        <w:t>Full Stack Developer</w:t>
-      </w:r>
-    </w:p>
-    <w:p>
-      <w:pPr>
-        <w:keepNext/>
-        <w:spacing w:before="0" w:after="40"/>
-      </w:pPr>
-      <w:r>
-        <w:rPr>
-          <w:rFonts w:ascii="Calibri" w:hAnsi="Calibri" w:eastAsia="Calibri"/>
-          <w:b w:val="0"/>
-          <w:color w:val="7F7F7F"/>
-          <w:sz w:val="20"/>
-        </w:rPr>
-        <w:t>Full-time · Oct 2025 - Sep 2026</w:t>
-      </w:r>
-    </w:p>
-    <w:p>
-      <w:pPr>
-        <w:pStyle w:val="ListBullet"/>
-        <w:spacing w:before="0" w:after="20"/>
-        <w:ind w:left="360"/>
-      </w:pPr>
-      <w:r>
-        <w:rPr>
-          <w:rFonts w:ascii="Calibri" w:hAnsi="Calibri" w:eastAsia="Calibri"/>
-          <w:b w:val="0"/>
-          <w:color w:val="000000"/>
-          <w:sz w:val="22"/>
-        </w:rPr>
-        <w:t>Sole developer of KeyCars (keycars.fr), a multi-tenant car rental SaaS in Laravel 12, React, TypeScript and MySQL: 50+ domain models, company-scoped tenancy, and admin, manager and field agent roles.</w:t>
-      </w:r>
-    </w:p>
-    <w:p>
-      <w:pPr>
-        <w:pStyle w:val="ListBullet"/>
-        <w:spacing w:before="0" w:after="20"/>
-        <w:ind w:left="360"/>
-      </w:pPr>
-      <w:r>
-        <w:rPr>
-          <w:rFonts w:ascii="Calibri" w:hAnsi="Calibri" w:eastAsia="Calibri"/>
-          <w:b w:val="0"/>
-          <w:color w:val="000000"/>
-          <w:sz w:val="22"/>
-        </w:rPr>
-        <w:t>Built a pricing engine that picks the daily rate from plans, duration tiers, packages and seasonal rates.</w:t>
-      </w:r>
-    </w:p>
-    <w:p>
-      <w:pPr>
-        <w:pStyle w:val="ListBullet"/>
-        <w:spacing w:before="0" w:after="20"/>
-        <w:ind w:left="360"/>
-      </w:pPr>
-      <w:r>
-        <w:rPr>
-          <w:rFonts w:ascii="Calibri" w:hAnsi="Calibri" w:eastAsia="Calibri"/>
-          <w:b w:val="0"/>
-          <w:color w:val="000000"/>
-          <w:sz w:val="22"/>
-        </w:rPr>
-        <w:t>Automated quotes, contracts and invoices as PDFs, added camera OCR for customer records, and built vehicle inspections with damage diagrams, photos and dual signatures.</w:t>
-      </w:r>
-    </w:p>
-    <w:p>
-      <w:pPr>
-        <w:pStyle w:val="ListBullet"/>
-        <w:spacing w:before="0" w:after="20"/>
-        <w:ind w:left="360"/>
-      </w:pPr>
-      <w:r>
-        <w:rPr>
-          <w:rFonts w:ascii="Calibri" w:hAnsi="Calibri" w:eastAsia="Calibri"/>
-          <w:b w:val="0"/>
-          <w:color w:val="000000"/>
-          <w:sz w:val="22"/>
-        </w:rPr>
-        <w:t>QA on rentflo.fr, a related rental product.</w:t>
-      </w:r>
-    </w:p>
-    <w:p>
-      <w:pPr>
-        <w:keepNext/>
-        <w:spacing w:before="80" w:after="0"/>
-      </w:pPr>
-      <w:r>
-        <w:rPr>
-          <w:rFonts w:ascii="Calibri" w:hAnsi="Calibri" w:eastAsia="Calibri"/>
-          <w:b/>
-          <w:color w:val="000000"/>
-          <w:sz w:val="22"/>
-        </w:rPr>
-        <w:t>Full Stack Developer</w:t>
-      </w:r>
-    </w:p>
-    <w:p>
-      <w:pPr>
-        <w:keepNext/>
-        <w:spacing w:before="0" w:after="40"/>
-      </w:pPr>
-      <w:r>
-        <w:rPr>
-          <w:rFonts w:ascii="Calibri" w:hAnsi="Calibri" w:eastAsia="Calibri"/>
-          <w:b w:val="0"/>
-          <w:color w:val="7F7F7F"/>
-          <w:sz w:val="20"/>
-        </w:rPr>
-        <w:t>Part-time · Jun 2025 - Oct 2025</w:t>
-      </w:r>
-    </w:p>
-    <w:p>
-      <w:pPr>
-        <w:pStyle w:val="ListBullet"/>
-        <w:spacing w:before="0" w:after="20"/>
-        <w:ind w:left="360"/>
-      </w:pPr>
-      <w:r>
-        <w:rPr>
-          <w:rFonts w:ascii="Calibri" w:hAnsi="Calibri" w:eastAsia="Calibri"/>
-          <w:b w:val="0"/>
-          <w:color w:val="000000"/>
-          <w:sz w:val="22"/>
-        </w:rPr>
-        <w:t>Built tracking-dashboard.fr: white-label, multi-tenant marketing dashboards in React, TypeScript and Supabase, fed by scheduled n8n workflows, replacing manually built client reports.</w:t>
-      </w:r>
-    </w:p>
-    <w:p>
-      <w:pPr>
-        <w:pStyle w:val="ListBullet"/>
-        <w:spacing w:before="0" w:after="20"/>
-        <w:ind w:left="360"/>
-      </w:pPr>
-      <w:r>
-        <w:rPr>
-          <w:rFonts w:ascii="Calibri" w:hAnsi="Calibri" w:eastAsia="Calibri"/>
-          <w:b w:val="0"/>
-          <w:color w:val="000000"/>
-          <w:sz w:val="22"/>
-        </w:rPr>
-        <w:t>Built custom WordPress plugins for the agency.</w:t>
-      </w:r>
-    </w:p>
-    <w:p>
-      <w:pPr>
-        <w:keepNext/>
-        <w:spacing w:before="160" w:after="20"/>
-      </w:pPr>
-      <w:r>
-        <w:rPr>
-          <w:rFonts w:ascii="Calibri" w:hAnsi="Calibri" w:eastAsia="Calibri"/>
-          <w:b/>
-          <w:color w:val="000000"/>
-          <w:sz w:val="22"/>
-        </w:rPr>
-        <w:t>Agileum</w:t>
-      </w:r>
-      <w:r>
-        <w:rPr>
-          <w:rFonts w:ascii="Calibri" w:hAnsi="Calibri" w:eastAsia="Calibri"/>
-          <w:b w:val="0"/>
-          <w:color w:val="7F7F7F"/>
-          <w:sz w:val="20"/>
-        </w:rPr>
-        <w:t xml:space="preserve"> | Mauritius · Hybrid</w:t>
-      </w:r>
-    </w:p>
-    <w:p>
-      <w:pPr>
-        <w:keepNext/>
-        <w:spacing w:before="80" w:after="0"/>
-      </w:pPr>
-      <w:r>
-        <w:rPr>
-          <w:rFonts w:ascii="Calibri" w:hAnsi="Calibri" w:eastAsia="Calibri"/>
-          <w:b/>
-          <w:color w:val="000000"/>
-          <w:sz w:val="22"/>
-        </w:rPr>
-        <w:t>Full Stack Web Developer</w:t>
-      </w:r>
-    </w:p>
-    <w:p>
-      <w:pPr>
-        <w:keepNext/>
-        <w:spacing w:before="0" w:after="40"/>
-      </w:pPr>
-      <w:r>
-        <w:rPr>
-          <w:rFonts w:ascii="Calibri" w:hAnsi="Calibri" w:eastAsia="Calibri"/>
-          <w:b w:val="0"/>
-          <w:color w:val="7F7F7F"/>
-          <w:sz w:val="20"/>
-        </w:rPr>
-        <w:t>Contract · Oct 2025 - Apr 2026</w:t>
-      </w:r>
-    </w:p>
-    <w:p>
-      <w:pPr>
-        <w:pStyle w:val="ListBullet"/>
-        <w:spacing w:before="0" w:after="20"/>
-        <w:ind w:left="360"/>
-      </w:pPr>
-      <w:r>
-        <w:rPr>
-          <w:rFonts w:ascii="Calibri" w:hAnsi="Calibri" w:eastAsia="Calibri"/>
-          <w:b w:val="0"/>
-          <w:color w:val="000000"/>
-          <w:sz w:val="22"/>
-        </w:rPr>
-        <w:t>Contract continuation of client work from the full-time role: new features, integrations and production fixes.</w:t>
-      </w:r>
-    </w:p>
-    <w:p>
-      <w:pPr>
-        <w:keepNext/>
-        <w:spacing w:before="80" w:after="0"/>
-      </w:pPr>
-      <w:r>
-        <w:rPr>
-          <w:rFonts w:ascii="Calibri" w:hAnsi="Calibri" w:eastAsia="Calibri"/>
-          <w:b/>
-          <w:color w:val="000000"/>
-          <w:sz w:val="22"/>
-        </w:rPr>
-        <w:t>Associate Software Engineer</w:t>
-      </w:r>
-    </w:p>
-    <w:p>
-      <w:pPr>
-        <w:keepNext/>
-        <w:spacing w:before="0" w:after="40"/>
-      </w:pPr>
-      <w:r>
-        <w:rPr>
-          <w:rFonts w:ascii="Calibri" w:hAnsi="Calibri" w:eastAsia="Calibri"/>
-          <w:b w:val="0"/>
-          <w:color w:val="7F7F7F"/>
-          <w:sz w:val="20"/>
-        </w:rPr>
-        <w:t>Full-time · Jan 2025 - Oct 2025</w:t>
+        <w:t>Jan 2025 – Oct 2025</w:t>
       </w:r>
     </w:p>
     <w:p>
@@ -906,51 +762,6 @@
     <w:p>
       <w:pPr>
         <w:keepNext/>
-        <w:spacing w:before="160" w:after="20"/>
-      </w:pPr>
-      <w:r>
-        <w:rPr>
-          <w:rFonts w:ascii="Calibri" w:hAnsi="Calibri" w:eastAsia="Calibri"/>
-          <w:b/>
-          <w:color w:val="000000"/>
-          <w:sz w:val="22"/>
-        </w:rPr>
-        <w:t>Safyr Utilis</w:t>
-      </w:r>
-      <w:r>
-        <w:rPr>
-          <w:rFonts w:ascii="Calibri" w:hAnsi="Calibri" w:eastAsia="Calibri"/>
-          <w:b w:val="0"/>
-          <w:color w:val="7F7F7F"/>
-          <w:sz w:val="20"/>
-        </w:rPr>
-        <w:t xml:space="preserve"> | Remote</w:t>
-      </w:r>
-      <w:r>
-        <w:rPr>
-          <w:rFonts w:ascii="Calibri" w:hAnsi="Calibri" w:eastAsia="Calibri"/>
-          <w:b w:val="0"/>
-          <w:color w:val="7F7F7F"/>
-          <w:sz w:val="20"/>
-        </w:rPr>
-        <w:t xml:space="preserve"> · </w:t>
-      </w:r>
-      <w:hyperlink r:id="rId15">
-        <w:r>
-          <w:rPr>
-            <w:color w:val="7F7F7F"/>
-            <w:u w:val="single"/>
-            <w:sz w:val="20"/>
-            <w:szCs w:val="20"/>
-            <w:rFonts w:ascii="Calibri" w:hAnsi="Calibri" w:eastAsia="Calibri"/>
-          </w:rPr>
-          <w:t>syul.mu</w:t>
-        </w:r>
-      </w:hyperlink>
-    </w:p>
-    <w:p>
-      <w:pPr>
-        <w:keepNext/>
         <w:spacing w:before="80" w:after="0"/>
       </w:pPr>
       <w:r>
@@ -960,7 +771,7 @@
           <w:color w:val="000000"/>
           <w:sz w:val="22"/>
         </w:rPr>
-        <w:t>Web Developer</w:t>
+        <w:t>Full Stack Web Developer (contract)</w:t>
       </w:r>
     </w:p>
     <w:p>
@@ -975,7 +786,7 @@
           <w:color w:val="7F7F7F"/>
           <w:sz w:val="20"/>
         </w:rPr>
-        <w:t>Contract · Feb 2025 - Nov 2025</w:t>
+        <w:t>Oct 2025 – Apr 2026</w:t>
       </w:r>
     </w:p>
     <w:p>
@@ -991,7 +802,7 @@
           <w:color w:val="000000"/>
           <w:sz w:val="22"/>
         </w:rPr>
-        <w:t>Designed, built and deployed the company website as sole developer, with a responsive layout the team edits itself after handover.</w:t>
+        <w:t>Continued client work after the full-time role: new features, integrations and production fixes.</w:t>
       </w:r>
     </w:p>
     <w:p>
@@ -1006,7 +817,7 @@
           <w:color w:val="000000"/>
           <w:sz w:val="22"/>
         </w:rPr>
-        <w:t>Business Force Limited</w:t>
+        <w:t>Career break</w:t>
       </w:r>
       <w:r>
         <w:rPr>
@@ -1015,7 +826,47 @@
           <w:color w:val="7F7F7F"/>
           <w:sz w:val="20"/>
         </w:rPr>
-        <w:t xml:space="preserve"> | Curepipe · Hybrid</w:t>
+        <w:t xml:space="preserve"> | Oct 2024 – Dec 2024</w:t>
+      </w:r>
+    </w:p>
+    <w:p>
+      <w:pPr>
+        <w:pStyle w:val="ListBullet"/>
+        <w:spacing w:before="0" w:after="20"/>
+        <w:ind w:left="360"/>
+      </w:pPr>
+      <w:r>
+        <w:rPr>
+          <w:rFonts w:ascii="Calibri" w:hAnsi="Calibri" w:eastAsia="Calibri"/>
+          <w:b w:val="0"/>
+          <w:color w:val="000000"/>
+          <w:sz w:val="22"/>
+        </w:rPr>
+        <w:t>Built and sold custom gaming PCs between roles.</w:t>
+      </w:r>
+    </w:p>
+    <w:p>
+      <w:pPr>
+        <w:keepNext/>
+        <w:spacing w:before="160" w:after="20"/>
+      </w:pPr>
+      <w:r>
+        <w:rPr>
+          <w:rFonts w:ascii="Calibri" w:hAnsi="Calibri" w:eastAsia="Calibri"/>
+          <w:b/>
+          <w:color w:val="000000"/>
+          <w:sz w:val="22"/>
+        </w:rPr>
+        <w:t>Business Force Limited (Curepipe, hybrid)</w:t>
+      </w:r>
+      <w:r>
+        <w:rPr>
+          <w:rFonts w:ascii="Calibri" w:hAnsi="Calibri" w:eastAsia="Calibri"/>
+          <w:b w:val="0"/>
+          <w:color w:val="7F7F7F"/>
+          <w:sz w:val="20"/>
+        </w:rPr>
+        <w:t xml:space="preserve"> | Feb 2023 – Sep 2024</w:t>
       </w:r>
     </w:p>
     <w:p>
@@ -1030,22 +881,7 @@
           <w:color w:val="000000"/>
           <w:sz w:val="22"/>
         </w:rPr>
-        <w:t>Information System Engineer</w:t>
-      </w:r>
-    </w:p>
-    <w:p>
-      <w:pPr>
-        <w:keepNext/>
-        <w:spacing w:before="0" w:after="40"/>
-      </w:pPr>
-      <w:r>
-        <w:rPr>
-          <w:rFonts w:ascii="Calibri" w:hAnsi="Calibri" w:eastAsia="Calibri"/>
-          <w:b w:val="0"/>
-          <w:color w:val="7F7F7F"/>
-          <w:sz w:val="20"/>
-        </w:rPr>
-        <w:t>Full-time · Feb 2023 - Sep 2024</w:t>
+        <w:t>Information System Engineer (full-time), alongside my BSc studies</w:t>
       </w:r>
     </w:p>
     <w:p>
@@ -1077,7 +913,7 @@
           <w:color w:val="000000"/>
           <w:sz w:val="22"/>
         </w:rPr>
-        <w:t>Provided production support for users in New Zealand, Australia and France, investigating data issues in Oracle PL/SQL.</w:t>
+        <w:t>Provided production support as part of a team serving users in New Zealand, Australia and France, investigating data issues in Oracle PL/SQL.</w:t>
       </w:r>
     </w:p>
     <w:p>
@@ -1093,7 +929,7 @@
           <w:color w:val="000000"/>
           <w:sz w:val="22"/>
         </w:rPr>
-        <w:t>Worked on Laravel and REST API development, and mentored two interns.</w:t>
+        <w:t>Mentored two interns through onboarding and code reviews, and worked on Laravel and REST API development.</w:t>
       </w:r>
     </w:p>
     <w:p>
@@ -1122,13 +958,8 @@
           <w:color w:val="000000"/>
           <w:sz w:val="22"/>
         </w:rPr>
-        <w:t>University of Technology, Mauritius</w:t>
+        <w:t>BSc (Hons) Software Engineering, Upper Second Class (2:1)</w:t>
       </w:r>
-    </w:p>
-    <w:p>
-      <w:pPr>
-        <w:spacing w:after="0"/>
-      </w:pPr>
       <w:r>
         <w:rPr>
           <w:rFonts w:ascii="Calibri" w:hAnsi="Calibri" w:eastAsia="Calibri"/>
@@ -1136,7 +967,7 @@
           <w:color w:val="000000"/>
           <w:sz w:val="22"/>
         </w:rPr>
-        <w:t>BSc (Hons) Software Engineering, Upper Second Class (2:1)</w:t>
+        <w:t xml:space="preserve"> · University of Technology, Mauritius</w:t>
       </w:r>
       <w:r>
         <w:rPr>
@@ -1145,7 +976,7 @@
           <w:color w:val="7F7F7F"/>
           <w:sz w:val="20"/>
         </w:rPr>
-        <w:t xml:space="preserve">  Sep 2021 - 2025</w:t>
+        <w:t xml:space="preserve">  2021 – 2025</w:t>
       </w:r>
     </w:p>
     <w:p>
@@ -1159,12 +990,30 @@
           <w:color w:val="000000"/>
           <w:sz w:val="22"/>
         </w:rPr>
-        <w:t>Huawei</w:t>
+        <w:t>Seeds for the Future Program</w:t>
+      </w:r>
+      <w:r>
+        <w:rPr>
+          <w:rFonts w:ascii="Calibri" w:hAnsi="Calibri" w:eastAsia="Calibri"/>
+          <w:b w:val="0"/>
+          <w:color w:val="000000"/>
+          <w:sz w:val="22"/>
+        </w:rPr>
+        <w:t xml:space="preserve"> · Huawei</w:t>
+      </w:r>
+      <w:r>
+        <w:rPr>
+          <w:rFonts w:ascii="Calibri" w:hAnsi="Calibri" w:eastAsia="Calibri"/>
+          <w:b w:val="0"/>
+          <w:color w:val="7F7F7F"/>
+          <w:sz w:val="20"/>
+        </w:rPr>
+        <w:t xml:space="preserve">  2023 – 2024</w:t>
       </w:r>
     </w:p>
     <w:p>
       <w:pPr>
-        <w:spacing w:after="0"/>
+        <w:spacing w:before="40" w:after="40"/>
       </w:pPr>
       <w:r>
         <w:rPr>
@@ -1173,16 +1022,7 @@
           <w:color w:val="000000"/>
           <w:sz w:val="22"/>
         </w:rPr>
-        <w:t>Seeds for the Future Program</w:t>
-      </w:r>
-      <w:r>
-        <w:rPr>
-          <w:rFonts w:ascii="Calibri" w:hAnsi="Calibri" w:eastAsia="Calibri"/>
-          <w:b w:val="0"/>
-          <w:color w:val="7F7F7F"/>
-          <w:sz w:val="20"/>
-        </w:rPr>
-        <w:t xml:space="preserve">  2023 - 2024</w:t>
+        <w:t>Selected for Huawei's ICT programme, with training in cloud, 5G and IoT. In the Tech4Good team project, our pitch for a greenhouse robot that scans plants for disease and sends the data to a mobile app placed second.</w:t>
       </w:r>
     </w:p>
     <w:p>
@@ -1196,13 +1036,8 @@
           <w:color w:val="000000"/>
           <w:sz w:val="22"/>
         </w:rPr>
-        <w:t>Sir Abdool Raman Osman State College, Phoenix</w:t>
+        <w:t>Higher School Certificate</w:t>
       </w:r>
-    </w:p>
-    <w:p>
-      <w:pPr>
-        <w:spacing w:after="0"/>
-      </w:pPr>
       <w:r>
         <w:rPr>
           <w:rFonts w:ascii="Calibri" w:hAnsi="Calibri" w:eastAsia="Calibri"/>
@@ -1210,7 +1045,7 @@
           <w:color w:val="000000"/>
           <w:sz w:val="22"/>
         </w:rPr>
-        <w:t>Higher School Certificate</w:t>
+        <w:t xml:space="preserve"> · Sir Abdool Raman Osman State College, Phoenix</w:t>
       </w:r>
       <w:r>
         <w:rPr>
@@ -1219,7 +1054,7 @@
           <w:color w:val="7F7F7F"/>
           <w:sz w:val="20"/>
         </w:rPr>
-        <w:t xml:space="preserve">  Jan 2019 - Jun 2021</w:t>
+        <w:t xml:space="preserve">  2019 – 2021</w:t>
       </w:r>
     </w:p>
     <w:sectPr>

</xml_diff>

<commit_message>
Deploy: latest CV and education date sync.
Co-authored-by: Cursor <cursoragent@cursor.com>
</commit_message>
<xml_diff>
--- a/cv/Kishan-Sobhee-Resume.docx
+++ b/cv/Kishan-Sobhee-Resume.docx
@@ -159,6 +159,117 @@
           <w:color w:val="0B769F"/>
           <w:sz w:val="24"/>
         </w:rPr>
+        <w:t>EDUCATION</w:t>
+      </w:r>
+    </w:p>
+    <w:p>
+      <w:pPr>
+        <w:spacing w:before="80" w:after="0"/>
+      </w:pPr>
+      <w:r>
+        <w:rPr>
+          <w:rFonts w:ascii="Calibri" w:hAnsi="Calibri" w:eastAsia="Calibri"/>
+          <w:b/>
+          <w:color w:val="000000"/>
+          <w:sz w:val="21"/>
+        </w:rPr>
+        <w:t>BSc (Hons) Software Engineering</w:t>
+      </w:r>
+      <w:r>
+        <w:rPr>
+          <w:rFonts w:ascii="Calibri" w:hAnsi="Calibri" w:eastAsia="Calibri"/>
+          <w:b w:val="0"/>
+          <w:color w:val="000000"/>
+          <w:sz w:val="21"/>
+        </w:rPr>
+        <w:t xml:space="preserve"> · University of Technology, Mauritius</w:t>
+      </w:r>
+      <w:r>
+        <w:rPr>
+          <w:rFonts w:ascii="Calibri" w:hAnsi="Calibri" w:eastAsia="Calibri"/>
+          <w:b w:val="0"/>
+          <w:color w:val="7F7F7F"/>
+          <w:sz w:val="20"/>
+        </w:rPr>
+        <w:t xml:space="preserve"> · Sep 2021 – Oct 2025</w:t>
+      </w:r>
+    </w:p>
+    <w:p>
+      <w:pPr>
+        <w:spacing w:before="80" w:after="0"/>
+      </w:pPr>
+      <w:r>
+        <w:rPr>
+          <w:rFonts w:ascii="Calibri" w:hAnsi="Calibri" w:eastAsia="Calibri"/>
+          <w:b/>
+          <w:color w:val="000000"/>
+          <w:sz w:val="21"/>
+        </w:rPr>
+        <w:t>Seeds for the Future Program</w:t>
+      </w:r>
+      <w:r>
+        <w:rPr>
+          <w:rFonts w:ascii="Calibri" w:hAnsi="Calibri" w:eastAsia="Calibri"/>
+          <w:b w:val="0"/>
+          <w:color w:val="000000"/>
+          <w:sz w:val="21"/>
+        </w:rPr>
+        <w:t xml:space="preserve"> · Huawei</w:t>
+      </w:r>
+      <w:r>
+        <w:rPr>
+          <w:rFonts w:ascii="Calibri" w:hAnsi="Calibri" w:eastAsia="Calibri"/>
+          <w:b w:val="0"/>
+          <w:color w:val="7F7F7F"/>
+          <w:sz w:val="20"/>
+        </w:rPr>
+        <w:t xml:space="preserve"> · Jun 2023</w:t>
+      </w:r>
+    </w:p>
+    <w:p>
+      <w:pPr>
+        <w:spacing w:before="80" w:after="0"/>
+      </w:pPr>
+      <w:r>
+        <w:rPr>
+          <w:rFonts w:ascii="Calibri" w:hAnsi="Calibri" w:eastAsia="Calibri"/>
+          <w:b/>
+          <w:color w:val="000000"/>
+          <w:sz w:val="21"/>
+        </w:rPr>
+        <w:t>Higher School Certificate</w:t>
+      </w:r>
+      <w:r>
+        <w:rPr>
+          <w:rFonts w:ascii="Calibri" w:hAnsi="Calibri" w:eastAsia="Calibri"/>
+          <w:b w:val="0"/>
+          <w:color w:val="000000"/>
+          <w:sz w:val="21"/>
+        </w:rPr>
+        <w:t xml:space="preserve"> · Sir Abdool Raman Osman State College, Phoenix</w:t>
+      </w:r>
+      <w:r>
+        <w:rPr>
+          <w:rFonts w:ascii="Calibri" w:hAnsi="Calibri" w:eastAsia="Calibri"/>
+          <w:b w:val="0"/>
+          <w:color w:val="7F7F7F"/>
+          <w:sz w:val="20"/>
+        </w:rPr>
+        <w:t xml:space="preserve"> · Jan 2019 – Jun 2021</w:t>
+      </w:r>
+    </w:p>
+    <w:p>
+      <w:pPr>
+        <w:keepNext/>
+        <w:spacing w:before="240" w:after="80"/>
+      </w:pPr>
+      <w:r>
+        <w:rPr>
+          <w:rFonts w:ascii="Calibri" w:hAnsi="Calibri" w:eastAsia="Calibri"/>
+          <w:b/>
+          <w:color w:val="0B769F"/>
+          <w:sz w:val="24"/>
+        </w:rPr>
         <w:t>SKILLS</w:t>
       </w:r>
     </w:p>
@@ -266,7 +377,7 @@
           <w:color w:val="0B769F"/>
           <w:sz w:val="24"/>
         </w:rPr>
-        <w:t>EXPERIENCE</w:t>
+        <w:t>FREELANCE EXPERIENCE</w:t>
       </w:r>
     </w:p>
     <w:p>
@@ -304,7 +415,7 @@
           <w:color w:val="000000"/>
           <w:sz w:val="21"/>
         </w:rPr>
-        <w:t>Independent practice serving several clients concurrently, managed through clear scheduling and prioritisation. ISCL ran on fixed weekly hours; other engagements were deadline-based. Gathers requirements directly with each client and owns delivery from scope to production.</w:t>
+        <w:t>Independent practice serving several clients concurrently. Agileum was the employed role; ISCL started on evenings and weekends, then became the main client after the full-time role ended. Other client work was deadline-based. Gathers requirements directly with each client and owns delivery from scope to production.</w:t>
       </w:r>
     </w:p>
     <w:p>
@@ -724,6 +835,21 @@
     <w:p>
       <w:pPr>
         <w:keepNext/>
+        <w:spacing w:before="240" w:after="80"/>
+      </w:pPr>
+      <w:r>
+        <w:rPr>
+          <w:rFonts w:ascii="Calibri" w:hAnsi="Calibri" w:eastAsia="Calibri"/>
+          <w:b/>
+          <w:color w:val="0B769F"/>
+          <w:sz w:val="24"/>
+        </w:rPr>
+        <w:t>EMPLOYMENT HISTORY</w:t>
+      </w:r>
+    </w:p>
+    <w:p>
+      <w:pPr>
+        <w:keepNext/>
         <w:spacing w:before="160" w:after="20"/>
       </w:pPr>
       <w:r>
@@ -991,131 +1117,6 @@
           <w:sz w:val="21"/>
         </w:rPr>
         <w:t>Mentored two interns through onboarding and code reviews, and worked on Laravel and REST API development.</w:t>
-      </w:r>
-    </w:p>
-    <w:p>
-      <w:pPr>
-        <w:keepNext/>
-        <w:spacing w:before="240" w:after="80"/>
-      </w:pPr>
-      <w:r>
-        <w:rPr>
-          <w:rFonts w:ascii="Calibri" w:hAnsi="Calibri" w:eastAsia="Calibri"/>
-          <w:b/>
-          <w:color w:val="0B769F"/>
-          <w:sz w:val="24"/>
-        </w:rPr>
-        <w:t>EDUCATION</w:t>
-      </w:r>
-    </w:p>
-    <w:p>
-      <w:pPr>
-        <w:spacing w:before="80" w:after="0"/>
-      </w:pPr>
-      <w:r>
-        <w:rPr>
-          <w:rFonts w:ascii="Calibri" w:hAnsi="Calibri" w:eastAsia="Calibri"/>
-          <w:b/>
-          <w:color w:val="000000"/>
-          <w:sz w:val="21"/>
-        </w:rPr>
-        <w:t>BSc (Hons) Software Engineering, Upper Second Class (2:1)</w:t>
-      </w:r>
-      <w:r>
-        <w:rPr>
-          <w:rFonts w:ascii="Calibri" w:hAnsi="Calibri" w:eastAsia="Calibri"/>
-          <w:b w:val="0"/>
-          <w:color w:val="000000"/>
-          <w:sz w:val="21"/>
-        </w:rPr>
-        <w:t xml:space="preserve"> · University of Technology, Mauritius</w:t>
-      </w:r>
-      <w:r>
-        <w:rPr>
-          <w:rFonts w:ascii="Calibri" w:hAnsi="Calibri" w:eastAsia="Calibri"/>
-          <w:b w:val="0"/>
-          <w:color w:val="7F7F7F"/>
-          <w:sz w:val="20"/>
-        </w:rPr>
-        <w:t xml:space="preserve"> · 2021 – 2025</w:t>
-      </w:r>
-    </w:p>
-    <w:p>
-      <w:pPr>
-        <w:spacing w:before="80" w:after="0"/>
-      </w:pPr>
-      <w:r>
-        <w:rPr>
-          <w:rFonts w:ascii="Calibri" w:hAnsi="Calibri" w:eastAsia="Calibri"/>
-          <w:b/>
-          <w:color w:val="000000"/>
-          <w:sz w:val="21"/>
-        </w:rPr>
-        <w:t>Seeds for the Future Program</w:t>
-      </w:r>
-      <w:r>
-        <w:rPr>
-          <w:rFonts w:ascii="Calibri" w:hAnsi="Calibri" w:eastAsia="Calibri"/>
-          <w:b w:val="0"/>
-          <w:color w:val="000000"/>
-          <w:sz w:val="21"/>
-        </w:rPr>
-        <w:t xml:space="preserve"> · Huawei</w:t>
-      </w:r>
-      <w:r>
-        <w:rPr>
-          <w:rFonts w:ascii="Calibri" w:hAnsi="Calibri" w:eastAsia="Calibri"/>
-          <w:b w:val="0"/>
-          <w:color w:val="7F7F7F"/>
-          <w:sz w:val="20"/>
-        </w:rPr>
-        <w:t xml:space="preserve"> · 2023 – 2024</w:t>
-      </w:r>
-    </w:p>
-    <w:p>
-      <w:pPr>
-        <w:spacing w:before="40" w:after="40"/>
-      </w:pPr>
-      <w:r>
-        <w:rPr>
-          <w:rFonts w:ascii="Calibri" w:hAnsi="Calibri" w:eastAsia="Calibri"/>
-          <w:b w:val="0"/>
-          <w:color w:val="000000"/>
-          <w:sz w:val="21"/>
-        </w:rPr>
-        <w:t>Selected for Huawei's ICT programme, with training in cloud, 5G and IoT. In the Tech4Good team project, the team's pitch for a greenhouse robot that scans plants for disease and sends the data to a mobile app placed second.</w:t>
-      </w:r>
-    </w:p>
-    <w:p>
-      <w:pPr>
-        <w:spacing w:before="80" w:after="0"/>
-      </w:pPr>
-      <w:r>
-        <w:rPr>
-          <w:rFonts w:ascii="Calibri" w:hAnsi="Calibri" w:eastAsia="Calibri"/>
-          <w:b/>
-          <w:color w:val="000000"/>
-          <w:sz w:val="21"/>
-        </w:rPr>
-        <w:t>Higher School Certificate</w:t>
-      </w:r>
-      <w:r>
-        <w:rPr>
-          <w:rFonts w:ascii="Calibri" w:hAnsi="Calibri" w:eastAsia="Calibri"/>
-          <w:b w:val="0"/>
-          <w:color w:val="000000"/>
-          <w:sz w:val="21"/>
-        </w:rPr>
-        <w:t xml:space="preserve"> · Sir Abdool Raman Osman State College, Phoenix</w:t>
-      </w:r>
-      <w:r>
-        <w:rPr>
-          <w:rFonts w:ascii="Calibri" w:hAnsi="Calibri" w:eastAsia="Calibri"/>
-          <w:b w:val="0"/>
-          <w:color w:val="7F7F7F"/>
-          <w:sz w:val="20"/>
-        </w:rPr>
-        <w:t xml:space="preserve"> · 2019 – 2021</w:t>
       </w:r>
     </w:p>
     <w:sectPr>

</xml_diff>